<commit_message>
docs: fix cropped images in REPORT.docx
- Render image-only markdown paragraphs as their own centered blocks (was inline-anchored, which Word clipped).
- Bound every image by both width AND height so nothing exceeds the page.
- Table-cell images now use a per-column width budget (~3" for 2-col tables) instead of a flat 5.5" cap that overflowed the cell.
- Widen page margins to 0.6" sides / 0.7" top-bottom for a 7.3" usable width.
</commit_message>
<xml_diff>
--- a/REPORT.docx
+++ b/REPORT.docx
@@ -1251,13 +1251,13 @@
         <w:tblLook w:firstColumn="1" w:firstRow="1" w:lastColumn="0" w:lastRow="0" w:noHBand="0" w:noVBand="1" w:val="04A0"/>
       </w:tblPr>
       <w:tblGrid>
-        <w:gridCol w:w="4320"/>
-        <w:gridCol w:w="4320"/>
+        <w:gridCol w:w="5256"/>
+        <w:gridCol w:w="5256"/>
       </w:tblGrid>
       <w:tr>
         <w:tc>
           <w:tcPr>
-            <w:tcW w:type="dxa" w:w="4320"/>
+            <w:tcW w:type="dxa" w:w="5256"/>
             <w:vAlign w:val="center"/>
           </w:tcPr>
           <w:p>
@@ -1272,7 +1272,7 @@
         </w:tc>
         <w:tc>
           <w:tcPr>
-            <w:tcW w:type="dxa" w:w="4320"/>
+            <w:tcW w:type="dxa" w:w="5256"/>
             <w:vAlign w:val="center"/>
           </w:tcPr>
           <w:p>
@@ -1289,13 +1289,13 @@
       <w:tr>
         <w:tc>
           <w:tcPr>
-            <w:tcW w:type="dxa" w:w="4320"/>
+            <w:tcW w:type="dxa" w:w="5256"/>
           </w:tcPr>
           <w:p>
             <w:r>
               <w:drawing>
                 <wp:inline xmlns:a="http://schemas.openxmlformats.org/drawingml/2006/main" xmlns:pic="http://schemas.openxmlformats.org/drawingml/2006/picture">
-                  <wp:extent cx="5486400" cy="4389120"/>
+                  <wp:extent cx="2788920" cy="2231136"/>
                   <wp:docPr id="1" name="Picture 1"/>
                   <wp:cNvGraphicFramePr>
                     <a:graphicFrameLocks noChangeAspect="1"/>
@@ -1316,7 +1316,7 @@
                         <pic:spPr>
                           <a:xfrm>
                             <a:off x="0" y="0"/>
-                            <a:ext cx="5486400" cy="4389120"/>
+                            <a:ext cx="2788920" cy="2231136"/>
                           </a:xfrm>
                           <a:prstGeom prst="rect"/>
                         </pic:spPr>
@@ -1330,7 +1330,7 @@
         </w:tc>
         <w:tc>
           <w:tcPr>
-            <w:tcW w:type="dxa" w:w="4320"/>
+            <w:tcW w:type="dxa" w:w="5256"/>
           </w:tcPr>
           <w:p>
             <w:r>
@@ -1346,13 +1346,13 @@
       <w:tr>
         <w:tc>
           <w:tcPr>
-            <w:tcW w:type="dxa" w:w="4320"/>
+            <w:tcW w:type="dxa" w:w="5256"/>
           </w:tcPr>
           <w:p>
             <w:r>
               <w:drawing>
                 <wp:inline xmlns:a="http://schemas.openxmlformats.org/drawingml/2006/main" xmlns:pic="http://schemas.openxmlformats.org/drawingml/2006/picture">
-                  <wp:extent cx="5486400" cy="2954215"/>
+                  <wp:extent cx="2788920" cy="1501726"/>
                   <wp:docPr id="2" name="Picture 2"/>
                   <wp:cNvGraphicFramePr>
                     <a:graphicFrameLocks noChangeAspect="1"/>
@@ -1373,7 +1373,7 @@
                         <pic:spPr>
                           <a:xfrm>
                             <a:off x="0" y="0"/>
-                            <a:ext cx="5486400" cy="2954215"/>
+                            <a:ext cx="2788920" cy="1501726"/>
                           </a:xfrm>
                           <a:prstGeom prst="rect"/>
                         </pic:spPr>
@@ -1387,7 +1387,7 @@
         </w:tc>
         <w:tc>
           <w:tcPr>
-            <w:tcW w:type="dxa" w:w="4320"/>
+            <w:tcW w:type="dxa" w:w="5256"/>
           </w:tcPr>
           <w:p>
             <w:r>
@@ -1444,13 +1444,13 @@
       <w:tr>
         <w:tc>
           <w:tcPr>
-            <w:tcW w:type="dxa" w:w="4320"/>
+            <w:tcW w:type="dxa" w:w="5256"/>
           </w:tcPr>
           <w:p>
             <w:r>
               <w:drawing>
                 <wp:inline xmlns:a="http://schemas.openxmlformats.org/drawingml/2006/main" xmlns:pic="http://schemas.openxmlformats.org/drawingml/2006/picture">
-                  <wp:extent cx="5486400" cy="2954215"/>
+                  <wp:extent cx="2788920" cy="1501726"/>
                   <wp:docPr id="3" name="Picture 3"/>
                   <wp:cNvGraphicFramePr>
                     <a:graphicFrameLocks noChangeAspect="1"/>
@@ -1471,7 +1471,7 @@
                         <pic:spPr>
                           <a:xfrm>
                             <a:off x="0" y="0"/>
-                            <a:ext cx="5486400" cy="2954215"/>
+                            <a:ext cx="2788920" cy="1501726"/>
                           </a:xfrm>
                           <a:prstGeom prst="rect"/>
                         </pic:spPr>
@@ -1485,7 +1485,7 @@
         </w:tc>
         <w:tc>
           <w:tcPr>
-            <w:tcW w:type="dxa" w:w="4320"/>
+            <w:tcW w:type="dxa" w:w="5256"/>
           </w:tcPr>
           <w:p>
             <w:r>
@@ -1533,13 +1533,13 @@
       <w:tr>
         <w:tc>
           <w:tcPr>
-            <w:tcW w:type="dxa" w:w="4320"/>
+            <w:tcW w:type="dxa" w:w="5256"/>
           </w:tcPr>
           <w:p>
             <w:r>
               <w:drawing>
                 <wp:inline xmlns:a="http://schemas.openxmlformats.org/drawingml/2006/main" xmlns:pic="http://schemas.openxmlformats.org/drawingml/2006/picture">
-                  <wp:extent cx="5486400" cy="2400300"/>
+                  <wp:extent cx="2788920" cy="1220152"/>
                   <wp:docPr id="4" name="Picture 4"/>
                   <wp:cNvGraphicFramePr>
                     <a:graphicFrameLocks noChangeAspect="1"/>
@@ -1560,7 +1560,7 @@
                         <pic:spPr>
                           <a:xfrm>
                             <a:off x="0" y="0"/>
-                            <a:ext cx="5486400" cy="2400300"/>
+                            <a:ext cx="2788920" cy="1220152"/>
                           </a:xfrm>
                           <a:prstGeom prst="rect"/>
                         </pic:spPr>
@@ -1574,7 +1574,7 @@
         </w:tc>
         <w:tc>
           <w:tcPr>
-            <w:tcW w:type="dxa" w:w="4320"/>
+            <w:tcW w:type="dxa" w:w="5256"/>
           </w:tcPr>
           <w:p>
             <w:r>
@@ -1615,13 +1615,13 @@
       <w:tr>
         <w:tc>
           <w:tcPr>
-            <w:tcW w:type="dxa" w:w="4320"/>
+            <w:tcW w:type="dxa" w:w="5256"/>
           </w:tcPr>
           <w:p>
             <w:r>
               <w:drawing>
                 <wp:inline xmlns:a="http://schemas.openxmlformats.org/drawingml/2006/main" xmlns:pic="http://schemas.openxmlformats.org/drawingml/2006/picture">
-                  <wp:extent cx="5486400" cy="4389120"/>
+                  <wp:extent cx="2788920" cy="2231136"/>
                   <wp:docPr id="5" name="Picture 5"/>
                   <wp:cNvGraphicFramePr>
                     <a:graphicFrameLocks noChangeAspect="1"/>
@@ -1642,7 +1642,7 @@
                         <pic:spPr>
                           <a:xfrm>
                             <a:off x="0" y="0"/>
-                            <a:ext cx="5486400" cy="4389120"/>
+                            <a:ext cx="2788920" cy="2231136"/>
                           </a:xfrm>
                           <a:prstGeom prst="rect"/>
                         </pic:spPr>
@@ -1656,7 +1656,7 @@
         </w:tc>
         <w:tc>
           <w:tcPr>
-            <w:tcW w:type="dxa" w:w="4320"/>
+            <w:tcW w:type="dxa" w:w="5256"/>
           </w:tcPr>
           <w:p>
             <w:r>
@@ -1672,13 +1672,13 @@
       <w:tr>
         <w:tc>
           <w:tcPr>
-            <w:tcW w:type="dxa" w:w="4320"/>
+            <w:tcW w:type="dxa" w:w="5256"/>
           </w:tcPr>
           <w:p>
             <w:r>
               <w:drawing>
                 <wp:inline xmlns:a="http://schemas.openxmlformats.org/drawingml/2006/main" xmlns:pic="http://schemas.openxmlformats.org/drawingml/2006/picture">
-                  <wp:extent cx="5486400" cy="3429000"/>
+                  <wp:extent cx="2788920" cy="1743075"/>
                   <wp:docPr id="6" name="Picture 6"/>
                   <wp:cNvGraphicFramePr>
                     <a:graphicFrameLocks noChangeAspect="1"/>
@@ -1699,7 +1699,7 @@
                         <pic:spPr>
                           <a:xfrm>
                             <a:off x="0" y="0"/>
-                            <a:ext cx="5486400" cy="3429000"/>
+                            <a:ext cx="2788920" cy="1743075"/>
                           </a:xfrm>
                           <a:prstGeom prst="rect"/>
                         </pic:spPr>
@@ -1713,7 +1713,7 @@
         </w:tc>
         <w:tc>
           <w:tcPr>
-            <w:tcW w:type="dxa" w:w="4320"/>
+            <w:tcW w:type="dxa" w:w="5256"/>
           </w:tcPr>
           <w:p>
             <w:r>
@@ -2112,13 +2112,13 @@
         <w:tblLook w:firstColumn="1" w:firstRow="1" w:lastColumn="0" w:lastRow="0" w:noHBand="0" w:noVBand="1" w:val="04A0"/>
       </w:tblPr>
       <w:tblGrid>
-        <w:gridCol w:w="4320"/>
-        <w:gridCol w:w="4320"/>
+        <w:gridCol w:w="5256"/>
+        <w:gridCol w:w="5256"/>
       </w:tblGrid>
       <w:tr>
         <w:tc>
           <w:tcPr>
-            <w:tcW w:type="dxa" w:w="4320"/>
+            <w:tcW w:type="dxa" w:w="5256"/>
             <w:vAlign w:val="center"/>
           </w:tcPr>
           <w:p>
@@ -2133,7 +2133,7 @@
         </w:tc>
         <w:tc>
           <w:tcPr>
-            <w:tcW w:type="dxa" w:w="4320"/>
+            <w:tcW w:type="dxa" w:w="5256"/>
             <w:vAlign w:val="center"/>
           </w:tcPr>
           <w:p>
@@ -2150,7 +2150,7 @@
       <w:tr>
         <w:tc>
           <w:tcPr>
-            <w:tcW w:type="dxa" w:w="4320"/>
+            <w:tcW w:type="dxa" w:w="5256"/>
           </w:tcPr>
           <w:p>
             <w:r>
@@ -2164,7 +2164,7 @@
         </w:tc>
         <w:tc>
           <w:tcPr>
-            <w:tcW w:type="dxa" w:w="4320"/>
+            <w:tcW w:type="dxa" w:w="5256"/>
           </w:tcPr>
           <w:p>
             <w:r>
@@ -2214,7 +2214,7 @@
       <w:tr>
         <w:tc>
           <w:tcPr>
-            <w:tcW w:type="dxa" w:w="4320"/>
+            <w:tcW w:type="dxa" w:w="5256"/>
           </w:tcPr>
           <w:p>
             <w:r>
@@ -2228,7 +2228,7 @@
         </w:tc>
         <w:tc>
           <w:tcPr>
-            <w:tcW w:type="dxa" w:w="4320"/>
+            <w:tcW w:type="dxa" w:w="5256"/>
           </w:tcPr>
           <w:p>
             <w:r>
@@ -2391,19 +2391,19 @@
         <w:tblLook w:firstColumn="1" w:firstRow="1" w:lastColumn="0" w:lastRow="0" w:noHBand="0" w:noVBand="1" w:val="04A0"/>
       </w:tblPr>
       <w:tblGrid>
-        <w:gridCol w:w="1080"/>
-        <w:gridCol w:w="1080"/>
-        <w:gridCol w:w="1080"/>
-        <w:gridCol w:w="1080"/>
-        <w:gridCol w:w="1080"/>
-        <w:gridCol w:w="1080"/>
-        <w:gridCol w:w="1080"/>
-        <w:gridCol w:w="1080"/>
+        <w:gridCol w:w="1314"/>
+        <w:gridCol w:w="1314"/>
+        <w:gridCol w:w="1314"/>
+        <w:gridCol w:w="1314"/>
+        <w:gridCol w:w="1314"/>
+        <w:gridCol w:w="1314"/>
+        <w:gridCol w:w="1314"/>
+        <w:gridCol w:w="1314"/>
       </w:tblGrid>
       <w:tr>
         <w:tc>
           <w:tcPr>
-            <w:tcW w:type="dxa" w:w="1080"/>
+            <w:tcW w:type="dxa" w:w="1314"/>
             <w:vAlign w:val="center"/>
           </w:tcPr>
           <w:p>
@@ -2418,7 +2418,7 @@
         </w:tc>
         <w:tc>
           <w:tcPr>
-            <w:tcW w:type="dxa" w:w="1080"/>
+            <w:tcW w:type="dxa" w:w="1314"/>
             <w:vAlign w:val="center"/>
           </w:tcPr>
           <w:p>
@@ -2433,7 +2433,7 @@
         </w:tc>
         <w:tc>
           <w:tcPr>
-            <w:tcW w:type="dxa" w:w="1080"/>
+            <w:tcW w:type="dxa" w:w="1314"/>
             <w:vAlign w:val="center"/>
           </w:tcPr>
           <w:p>
@@ -2448,7 +2448,7 @@
         </w:tc>
         <w:tc>
           <w:tcPr>
-            <w:tcW w:type="dxa" w:w="1080"/>
+            <w:tcW w:type="dxa" w:w="1314"/>
             <w:vAlign w:val="center"/>
           </w:tcPr>
           <w:p>
@@ -2463,7 +2463,7 @@
         </w:tc>
         <w:tc>
           <w:tcPr>
-            <w:tcW w:type="dxa" w:w="1080"/>
+            <w:tcW w:type="dxa" w:w="1314"/>
             <w:vAlign w:val="center"/>
           </w:tcPr>
           <w:p>
@@ -2478,7 +2478,7 @@
         </w:tc>
         <w:tc>
           <w:tcPr>
-            <w:tcW w:type="dxa" w:w="1080"/>
+            <w:tcW w:type="dxa" w:w="1314"/>
             <w:vAlign w:val="center"/>
           </w:tcPr>
           <w:p>
@@ -2493,7 +2493,7 @@
         </w:tc>
         <w:tc>
           <w:tcPr>
-            <w:tcW w:type="dxa" w:w="1080"/>
+            <w:tcW w:type="dxa" w:w="1314"/>
             <w:vAlign w:val="center"/>
           </w:tcPr>
           <w:p>
@@ -2508,7 +2508,7 @@
         </w:tc>
         <w:tc>
           <w:tcPr>
-            <w:tcW w:type="dxa" w:w="1080"/>
+            <w:tcW w:type="dxa" w:w="1314"/>
             <w:vAlign w:val="center"/>
           </w:tcPr>
           <w:p>
@@ -2537,7 +2537,7 @@
       <w:tr>
         <w:tc>
           <w:tcPr>
-            <w:tcW w:type="dxa" w:w="1080"/>
+            <w:tcW w:type="dxa" w:w="1314"/>
           </w:tcPr>
           <w:p>
             <w:r>
@@ -2564,7 +2564,7 @@
         </w:tc>
         <w:tc>
           <w:tcPr>
-            <w:tcW w:type="dxa" w:w="1080"/>
+            <w:tcW w:type="dxa" w:w="1314"/>
           </w:tcPr>
           <w:p>
             <w:r>
@@ -2580,7 +2580,7 @@
         </w:tc>
         <w:tc>
           <w:tcPr>
-            <w:tcW w:type="dxa" w:w="1080"/>
+            <w:tcW w:type="dxa" w:w="1314"/>
           </w:tcPr>
           <w:p>
             <w:r>
@@ -2594,7 +2594,7 @@
         </w:tc>
         <w:tc>
           <w:tcPr>
-            <w:tcW w:type="dxa" w:w="1080"/>
+            <w:tcW w:type="dxa" w:w="1314"/>
           </w:tcPr>
           <w:p>
             <w:r>
@@ -2608,7 +2608,7 @@
         </w:tc>
         <w:tc>
           <w:tcPr>
-            <w:tcW w:type="dxa" w:w="1080"/>
+            <w:tcW w:type="dxa" w:w="1314"/>
           </w:tcPr>
           <w:p>
             <w:r>
@@ -2634,7 +2634,7 @@
         </w:tc>
         <w:tc>
           <w:tcPr>
-            <w:tcW w:type="dxa" w:w="1080"/>
+            <w:tcW w:type="dxa" w:w="1314"/>
           </w:tcPr>
           <w:p>
             <w:r>
@@ -2648,7 +2648,7 @@
         </w:tc>
         <w:tc>
           <w:tcPr>
-            <w:tcW w:type="dxa" w:w="1080"/>
+            <w:tcW w:type="dxa" w:w="1314"/>
           </w:tcPr>
           <w:p>
             <w:r>
@@ -2662,7 +2662,7 @@
         </w:tc>
         <w:tc>
           <w:tcPr>
-            <w:tcW w:type="dxa" w:w="1080"/>
+            <w:tcW w:type="dxa" w:w="1314"/>
           </w:tcPr>
           <w:p>
             <w:r>
@@ -2690,7 +2690,7 @@
       <w:tr>
         <w:tc>
           <w:tcPr>
-            <w:tcW w:type="dxa" w:w="1080"/>
+            <w:tcW w:type="dxa" w:w="1314"/>
           </w:tcPr>
           <w:p>
             <w:r>
@@ -2704,7 +2704,7 @@
         </w:tc>
         <w:tc>
           <w:tcPr>
-            <w:tcW w:type="dxa" w:w="1080"/>
+            <w:tcW w:type="dxa" w:w="1314"/>
           </w:tcPr>
           <w:p>
             <w:r>
@@ -2720,7 +2720,7 @@
         </w:tc>
         <w:tc>
           <w:tcPr>
-            <w:tcW w:type="dxa" w:w="1080"/>
+            <w:tcW w:type="dxa" w:w="1314"/>
           </w:tcPr>
           <w:p>
             <w:r>
@@ -2734,7 +2734,7 @@
         </w:tc>
         <w:tc>
           <w:tcPr>
-            <w:tcW w:type="dxa" w:w="1080"/>
+            <w:tcW w:type="dxa" w:w="1314"/>
           </w:tcPr>
           <w:p>
             <w:r>
@@ -2760,7 +2760,7 @@
         </w:tc>
         <w:tc>
           <w:tcPr>
-            <w:tcW w:type="dxa" w:w="1080"/>
+            <w:tcW w:type="dxa" w:w="1314"/>
           </w:tcPr>
           <w:p>
             <w:r>
@@ -2774,7 +2774,7 @@
         </w:tc>
         <w:tc>
           <w:tcPr>
-            <w:tcW w:type="dxa" w:w="1080"/>
+            <w:tcW w:type="dxa" w:w="1314"/>
           </w:tcPr>
           <w:p>
             <w:r>
@@ -2800,7 +2800,7 @@
         </w:tc>
         <w:tc>
           <w:tcPr>
-            <w:tcW w:type="dxa" w:w="1080"/>
+            <w:tcW w:type="dxa" w:w="1314"/>
           </w:tcPr>
           <w:p>
             <w:r>
@@ -2826,7 +2826,7 @@
         </w:tc>
         <w:tc>
           <w:tcPr>
-            <w:tcW w:type="dxa" w:w="1080"/>
+            <w:tcW w:type="dxa" w:w="1314"/>
           </w:tcPr>
           <w:p>
             <w:r>
@@ -3145,13 +3145,13 @@
         <w:tblLook w:firstColumn="1" w:firstRow="1" w:lastColumn="0" w:lastRow="0" w:noHBand="0" w:noVBand="1" w:val="04A0"/>
       </w:tblPr>
       <w:tblGrid>
-        <w:gridCol w:w="4320"/>
-        <w:gridCol w:w="4320"/>
+        <w:gridCol w:w="5256"/>
+        <w:gridCol w:w="5256"/>
       </w:tblGrid>
       <w:tr>
         <w:tc>
           <w:tcPr>
-            <w:tcW w:type="dxa" w:w="4320"/>
+            <w:tcW w:type="dxa" w:w="5256"/>
             <w:vAlign w:val="center"/>
           </w:tcPr>
           <w:p>
@@ -3166,7 +3166,7 @@
         </w:tc>
         <w:tc>
           <w:tcPr>
-            <w:tcW w:type="dxa" w:w="4320"/>
+            <w:tcW w:type="dxa" w:w="5256"/>
             <w:vAlign w:val="center"/>
           </w:tcPr>
           <w:p>
@@ -3183,13 +3183,13 @@
       <w:tr>
         <w:tc>
           <w:tcPr>
-            <w:tcW w:type="dxa" w:w="4320"/>
+            <w:tcW w:type="dxa" w:w="5256"/>
           </w:tcPr>
           <w:p>
             <w:r>
               <w:drawing>
                 <wp:inline xmlns:a="http://schemas.openxmlformats.org/drawingml/2006/main" xmlns:pic="http://schemas.openxmlformats.org/drawingml/2006/picture">
-                  <wp:extent cx="5486400" cy="5486400"/>
+                  <wp:extent cx="2788920" cy="2788920"/>
                   <wp:docPr id="7" name="Picture 7"/>
                   <wp:cNvGraphicFramePr>
                     <a:graphicFrameLocks noChangeAspect="1"/>
@@ -3210,7 +3210,7 @@
                         <pic:spPr>
                           <a:xfrm>
                             <a:off x="0" y="0"/>
-                            <a:ext cx="5486400" cy="5486400"/>
+                            <a:ext cx="2788920" cy="2788920"/>
                           </a:xfrm>
                           <a:prstGeom prst="rect"/>
                         </pic:spPr>
@@ -3224,13 +3224,13 @@
         </w:tc>
         <w:tc>
           <w:tcPr>
-            <w:tcW w:type="dxa" w:w="4320"/>
+            <w:tcW w:type="dxa" w:w="5256"/>
           </w:tcPr>
           <w:p>
             <w:r>
               <w:drawing>
                 <wp:inline xmlns:a="http://schemas.openxmlformats.org/drawingml/2006/main" xmlns:pic="http://schemas.openxmlformats.org/drawingml/2006/picture">
-                  <wp:extent cx="5486400" cy="5486400"/>
+                  <wp:extent cx="2788920" cy="2788920"/>
                   <wp:docPr id="8" name="Picture 8"/>
                   <wp:cNvGraphicFramePr>
                     <a:graphicFrameLocks noChangeAspect="1"/>
@@ -3251,7 +3251,7 @@
                         <pic:spPr>
                           <a:xfrm>
                             <a:off x="0" y="0"/>
-                            <a:ext cx="5486400" cy="5486400"/>
+                            <a:ext cx="2788920" cy="2788920"/>
                           </a:xfrm>
                           <a:prstGeom prst="rect"/>
                         </pic:spPr>
@@ -3267,13 +3267,13 @@
       <w:tr>
         <w:tc>
           <w:tcPr>
-            <w:tcW w:type="dxa" w:w="4320"/>
+            <w:tcW w:type="dxa" w:w="5256"/>
           </w:tcPr>
           <w:p>
             <w:r>
               <w:drawing>
                 <wp:inline xmlns:a="http://schemas.openxmlformats.org/drawingml/2006/main" xmlns:pic="http://schemas.openxmlformats.org/drawingml/2006/picture">
-                  <wp:extent cx="5486400" cy="4389120"/>
+                  <wp:extent cx="2788920" cy="2231136"/>
                   <wp:docPr id="9" name="Picture 9"/>
                   <wp:cNvGraphicFramePr>
                     <a:graphicFrameLocks noChangeAspect="1"/>
@@ -3294,7 +3294,7 @@
                         <pic:spPr>
                           <a:xfrm>
                             <a:off x="0" y="0"/>
-                            <a:ext cx="5486400" cy="4389120"/>
+                            <a:ext cx="2788920" cy="2231136"/>
                           </a:xfrm>
                           <a:prstGeom prst="rect"/>
                         </pic:spPr>
@@ -3308,13 +3308,13 @@
         </w:tc>
         <w:tc>
           <w:tcPr>
-            <w:tcW w:type="dxa" w:w="4320"/>
+            <w:tcW w:type="dxa" w:w="5256"/>
           </w:tcPr>
           <w:p>
             <w:r>
               <w:drawing>
                 <wp:inline xmlns:a="http://schemas.openxmlformats.org/drawingml/2006/main" xmlns:pic="http://schemas.openxmlformats.org/drawingml/2006/picture">
-                  <wp:extent cx="5486400" cy="4389120"/>
+                  <wp:extent cx="2788920" cy="2231136"/>
                   <wp:docPr id="10" name="Picture 10"/>
                   <wp:cNvGraphicFramePr>
                     <a:graphicFrameLocks noChangeAspect="1"/>
@@ -3335,7 +3335,7 @@
                         <pic:spPr>
                           <a:xfrm>
                             <a:off x="0" y="0"/>
-                            <a:ext cx="5486400" cy="4389120"/>
+                            <a:ext cx="2788920" cy="2231136"/>
                           </a:xfrm>
                           <a:prstGeom prst="rect"/>
                         </pic:spPr>
@@ -3471,14 +3471,14 @@
         <w:tblLook w:firstColumn="1" w:firstRow="1" w:lastColumn="0" w:lastRow="0" w:noHBand="0" w:noVBand="1" w:val="04A0"/>
       </w:tblPr>
       <w:tblGrid>
-        <w:gridCol w:w="2880"/>
-        <w:gridCol w:w="2880"/>
-        <w:gridCol w:w="2880"/>
+        <w:gridCol w:w="3504"/>
+        <w:gridCol w:w="3504"/>
+        <w:gridCol w:w="3504"/>
       </w:tblGrid>
       <w:tr>
         <w:tc>
           <w:tcPr>
-            <w:tcW w:type="dxa" w:w="2880"/>
+            <w:tcW w:type="dxa" w:w="3504"/>
             <w:vAlign w:val="center"/>
           </w:tcPr>
           <w:p>
@@ -3493,7 +3493,7 @@
         </w:tc>
         <w:tc>
           <w:tcPr>
-            <w:tcW w:type="dxa" w:w="2880"/>
+            <w:tcW w:type="dxa" w:w="3504"/>
             <w:vAlign w:val="center"/>
           </w:tcPr>
           <w:p>
@@ -3508,7 +3508,7 @@
         </w:tc>
         <w:tc>
           <w:tcPr>
-            <w:tcW w:type="dxa" w:w="2880"/>
+            <w:tcW w:type="dxa" w:w="3504"/>
             <w:vAlign w:val="center"/>
           </w:tcPr>
           <w:p>
@@ -3525,7 +3525,7 @@
       <w:tr>
         <w:tc>
           <w:tcPr>
-            <w:tcW w:type="dxa" w:w="2880"/>
+            <w:tcW w:type="dxa" w:w="3504"/>
           </w:tcPr>
           <w:p>
             <w:r>
@@ -3541,7 +3541,7 @@
         </w:tc>
         <w:tc>
           <w:tcPr>
-            <w:tcW w:type="dxa" w:w="2880"/>
+            <w:tcW w:type="dxa" w:w="3504"/>
           </w:tcPr>
           <w:p>
             <w:r>
@@ -3555,7 +3555,7 @@
         </w:tc>
         <w:tc>
           <w:tcPr>
-            <w:tcW w:type="dxa" w:w="2880"/>
+            <w:tcW w:type="dxa" w:w="3504"/>
           </w:tcPr>
           <w:p>
             <w:r>
@@ -3571,7 +3571,7 @@
       <w:tr>
         <w:tc>
           <w:tcPr>
-            <w:tcW w:type="dxa" w:w="2880"/>
+            <w:tcW w:type="dxa" w:w="3504"/>
           </w:tcPr>
           <w:p>
             <w:r>
@@ -3587,7 +3587,7 @@
         </w:tc>
         <w:tc>
           <w:tcPr>
-            <w:tcW w:type="dxa" w:w="2880"/>
+            <w:tcW w:type="dxa" w:w="3504"/>
           </w:tcPr>
           <w:p>
             <w:r>
@@ -3615,7 +3615,7 @@
         </w:tc>
         <w:tc>
           <w:tcPr>
-            <w:tcW w:type="dxa" w:w="2880"/>
+            <w:tcW w:type="dxa" w:w="3504"/>
           </w:tcPr>
           <w:p>
             <w:r>
@@ -3689,15 +3689,15 @@
         <w:tblLook w:firstColumn="1" w:firstRow="1" w:lastColumn="0" w:lastRow="0" w:noHBand="0" w:noVBand="1" w:val="04A0"/>
       </w:tblPr>
       <w:tblGrid>
-        <w:gridCol w:w="2160"/>
-        <w:gridCol w:w="2160"/>
-        <w:gridCol w:w="2160"/>
-        <w:gridCol w:w="2160"/>
+        <w:gridCol w:w="2628"/>
+        <w:gridCol w:w="2628"/>
+        <w:gridCol w:w="2628"/>
+        <w:gridCol w:w="2628"/>
       </w:tblGrid>
       <w:tr>
         <w:tc>
           <w:tcPr>
-            <w:tcW w:type="dxa" w:w="2160"/>
+            <w:tcW w:type="dxa" w:w="2628"/>
             <w:vAlign w:val="center"/>
           </w:tcPr>
           <w:p>
@@ -3712,7 +3712,7 @@
         </w:tc>
         <w:tc>
           <w:tcPr>
-            <w:tcW w:type="dxa" w:w="2160"/>
+            <w:tcW w:type="dxa" w:w="2628"/>
             <w:vAlign w:val="center"/>
           </w:tcPr>
           <w:p>
@@ -3727,7 +3727,7 @@
         </w:tc>
         <w:tc>
           <w:tcPr>
-            <w:tcW w:type="dxa" w:w="2160"/>
+            <w:tcW w:type="dxa" w:w="2628"/>
             <w:vAlign w:val="center"/>
           </w:tcPr>
           <w:p>
@@ -3742,7 +3742,7 @@
         </w:tc>
         <w:tc>
           <w:tcPr>
-            <w:tcW w:type="dxa" w:w="2160"/>
+            <w:tcW w:type="dxa" w:w="2628"/>
             <w:vAlign w:val="center"/>
           </w:tcPr>
           <w:p>
@@ -3759,7 +3759,7 @@
       <w:tr>
         <w:tc>
           <w:tcPr>
-            <w:tcW w:type="dxa" w:w="2160"/>
+            <w:tcW w:type="dxa" w:w="2628"/>
           </w:tcPr>
           <w:p>
             <w:r>
@@ -3775,7 +3775,7 @@
         </w:tc>
         <w:tc>
           <w:tcPr>
-            <w:tcW w:type="dxa" w:w="2160"/>
+            <w:tcW w:type="dxa" w:w="2628"/>
           </w:tcPr>
           <w:p>
             <w:r>
@@ -3789,7 +3789,7 @@
         </w:tc>
         <w:tc>
           <w:tcPr>
-            <w:tcW w:type="dxa" w:w="2160"/>
+            <w:tcW w:type="dxa" w:w="2628"/>
           </w:tcPr>
           <w:p>
             <w:r>
@@ -3803,7 +3803,7 @@
         </w:tc>
         <w:tc>
           <w:tcPr>
-            <w:tcW w:type="dxa" w:w="2160"/>
+            <w:tcW w:type="dxa" w:w="2628"/>
           </w:tcPr>
           <w:p>
             <w:r>
@@ -3819,7 +3819,7 @@
       <w:tr>
         <w:tc>
           <w:tcPr>
-            <w:tcW w:type="dxa" w:w="2160"/>
+            <w:tcW w:type="dxa" w:w="2628"/>
           </w:tcPr>
           <w:p>
             <w:r>
@@ -3835,7 +3835,7 @@
         </w:tc>
         <w:tc>
           <w:tcPr>
-            <w:tcW w:type="dxa" w:w="2160"/>
+            <w:tcW w:type="dxa" w:w="2628"/>
           </w:tcPr>
           <w:p>
             <w:r>
@@ -3849,7 +3849,7 @@
         </w:tc>
         <w:tc>
           <w:tcPr>
-            <w:tcW w:type="dxa" w:w="2160"/>
+            <w:tcW w:type="dxa" w:w="2628"/>
           </w:tcPr>
           <w:p>
             <w:r>
@@ -3863,7 +3863,7 @@
         </w:tc>
         <w:tc>
           <w:tcPr>
-            <w:tcW w:type="dxa" w:w="2160"/>
+            <w:tcW w:type="dxa" w:w="2628"/>
           </w:tcPr>
           <w:p>
             <w:r>
@@ -3879,7 +3879,7 @@
       <w:tr>
         <w:tc>
           <w:tcPr>
-            <w:tcW w:type="dxa" w:w="2160"/>
+            <w:tcW w:type="dxa" w:w="2628"/>
           </w:tcPr>
           <w:p>
             <w:r>
@@ -3908,7 +3908,7 @@
         </w:tc>
         <w:tc>
           <w:tcPr>
-            <w:tcW w:type="dxa" w:w="2160"/>
+            <w:tcW w:type="dxa" w:w="2628"/>
           </w:tcPr>
           <w:p>
             <w:r>
@@ -3922,7 +3922,7 @@
         </w:tc>
         <w:tc>
           <w:tcPr>
-            <w:tcW w:type="dxa" w:w="2160"/>
+            <w:tcW w:type="dxa" w:w="2628"/>
           </w:tcPr>
           <w:p>
             <w:r>
@@ -3936,7 +3936,7 @@
         </w:tc>
         <w:tc>
           <w:tcPr>
-            <w:tcW w:type="dxa" w:w="2160"/>
+            <w:tcW w:type="dxa" w:w="2628"/>
           </w:tcPr>
           <w:p>
             <w:r>
@@ -3964,7 +3964,7 @@
       <w:tr>
         <w:tc>
           <w:tcPr>
-            <w:tcW w:type="dxa" w:w="2160"/>
+            <w:tcW w:type="dxa" w:w="2628"/>
           </w:tcPr>
           <w:p>
             <w:r>
@@ -3980,7 +3980,7 @@
         </w:tc>
         <w:tc>
           <w:tcPr>
-            <w:tcW w:type="dxa" w:w="2160"/>
+            <w:tcW w:type="dxa" w:w="2628"/>
           </w:tcPr>
           <w:p>
             <w:r>
@@ -3994,7 +3994,7 @@
         </w:tc>
         <w:tc>
           <w:tcPr>
-            <w:tcW w:type="dxa" w:w="2160"/>
+            <w:tcW w:type="dxa" w:w="2628"/>
           </w:tcPr>
           <w:p>
             <w:r>
@@ -4008,7 +4008,7 @@
         </w:tc>
         <w:tc>
           <w:tcPr>
-            <w:tcW w:type="dxa" w:w="2160"/>
+            <w:tcW w:type="dxa" w:w="2628"/>
           </w:tcPr>
           <w:p>
             <w:r>
@@ -4024,7 +4024,7 @@
       <w:tr>
         <w:tc>
           <w:tcPr>
-            <w:tcW w:type="dxa" w:w="2160"/>
+            <w:tcW w:type="dxa" w:w="2628"/>
           </w:tcPr>
           <w:p>
             <w:r>
@@ -4040,7 +4040,7 @@
         </w:tc>
         <w:tc>
           <w:tcPr>
-            <w:tcW w:type="dxa" w:w="2160"/>
+            <w:tcW w:type="dxa" w:w="2628"/>
           </w:tcPr>
           <w:p>
             <w:r>
@@ -4054,7 +4054,7 @@
         </w:tc>
         <w:tc>
           <w:tcPr>
-            <w:tcW w:type="dxa" w:w="2160"/>
+            <w:tcW w:type="dxa" w:w="2628"/>
           </w:tcPr>
           <w:p>
             <w:r>
@@ -4068,7 +4068,7 @@
         </w:tc>
         <w:tc>
           <w:tcPr>
-            <w:tcW w:type="dxa" w:w="2160"/>
+            <w:tcW w:type="dxa" w:w="2628"/>
           </w:tcPr>
           <w:p>
             <w:r>
@@ -4136,10 +4136,13 @@
       </w:r>
     </w:p>
     <w:p>
+      <w:pPr>
+        <w:jc w:val="center"/>
+      </w:pPr>
       <w:r>
         <w:drawing>
           <wp:inline xmlns:a="http://schemas.openxmlformats.org/drawingml/2006/main" xmlns:pic="http://schemas.openxmlformats.org/drawingml/2006/picture">
-            <wp:extent cx="5486400" cy="2715859"/>
+            <wp:extent cx="5943600" cy="2942180"/>
             <wp:docPr id="11" name="Picture 11"/>
             <wp:cNvGraphicFramePr>
               <a:graphicFrameLocks noChangeAspect="1"/>
@@ -4160,7 +4163,7 @@
                   <pic:spPr>
                     <a:xfrm>
                       <a:off x="0" y="0"/>
-                      <a:ext cx="5486400" cy="2715859"/>
+                      <a:ext cx="5943600" cy="2942180"/>
                     </a:xfrm>
                     <a:prstGeom prst="rect"/>
                   </pic:spPr>
@@ -4172,6 +4175,19 @@
       </w:r>
     </w:p>
     <w:p>
+      <w:pPr>
+        <w:jc w:val="center"/>
+      </w:pPr>
+      <w:r>
+        <w:rPr>
+          <w:i/>
+          <w:color w:val="555555"/>
+          <w:sz w:val="18"/>
+        </w:rPr>
+        <w:t>All MLflow runs side-by-side</w:t>
+      </w:r>
+    </w:p>
+    <w:p>
       <w:r>
         <w:rPr>
           <w:b w:val="0"/>
@@ -4312,13 +4328,13 @@
         <w:tblLook w:firstColumn="1" w:firstRow="1" w:lastColumn="0" w:lastRow="0" w:noHBand="0" w:noVBand="1" w:val="04A0"/>
       </w:tblPr>
       <w:tblGrid>
-        <w:gridCol w:w="4320"/>
-        <w:gridCol w:w="4320"/>
+        <w:gridCol w:w="5256"/>
+        <w:gridCol w:w="5256"/>
       </w:tblGrid>
       <w:tr>
         <w:tc>
           <w:tcPr>
-            <w:tcW w:type="dxa" w:w="4320"/>
+            <w:tcW w:type="dxa" w:w="5256"/>
             <w:vAlign w:val="center"/>
           </w:tcPr>
           <w:p>
@@ -4333,7 +4349,7 @@
         </w:tc>
         <w:tc>
           <w:tcPr>
-            <w:tcW w:type="dxa" w:w="4320"/>
+            <w:tcW w:type="dxa" w:w="5256"/>
             <w:vAlign w:val="center"/>
           </w:tcPr>
           <w:p>
@@ -4350,7 +4366,7 @@
       <w:tr>
         <w:tc>
           <w:tcPr>
-            <w:tcW w:type="dxa" w:w="4320"/>
+            <w:tcW w:type="dxa" w:w="5256"/>
           </w:tcPr>
           <w:p>
             <w:r>
@@ -4376,7 +4392,7 @@
         </w:tc>
         <w:tc>
           <w:tcPr>
-            <w:tcW w:type="dxa" w:w="4320"/>
+            <w:tcW w:type="dxa" w:w="5256"/>
           </w:tcPr>
           <w:p>
             <w:r>
@@ -4410,7 +4426,7 @@
       <w:tr>
         <w:tc>
           <w:tcPr>
-            <w:tcW w:type="dxa" w:w="4320"/>
+            <w:tcW w:type="dxa" w:w="5256"/>
           </w:tcPr>
           <w:p>
             <w:r>
@@ -4436,7 +4452,7 @@
         </w:tc>
         <w:tc>
           <w:tcPr>
-            <w:tcW w:type="dxa" w:w="4320"/>
+            <w:tcW w:type="dxa" w:w="5256"/>
           </w:tcPr>
           <w:p>
             <w:r>
@@ -4550,7 +4566,7 @@
       <w:tr>
         <w:tc>
           <w:tcPr>
-            <w:tcW w:type="dxa" w:w="4320"/>
+            <w:tcW w:type="dxa" w:w="5256"/>
           </w:tcPr>
           <w:p>
             <w:r>
@@ -4576,7 +4592,7 @@
         </w:tc>
         <w:tc>
           <w:tcPr>
-            <w:tcW w:type="dxa" w:w="4320"/>
+            <w:tcW w:type="dxa" w:w="5256"/>
           </w:tcPr>
           <w:p>
             <w:r>
@@ -4610,7 +4626,7 @@
       <w:tr>
         <w:tc>
           <w:tcPr>
-            <w:tcW w:type="dxa" w:w="4320"/>
+            <w:tcW w:type="dxa" w:w="5256"/>
           </w:tcPr>
           <w:p>
             <w:r>
@@ -4636,7 +4652,7 @@
         </w:tc>
         <w:tc>
           <w:tcPr>
-            <w:tcW w:type="dxa" w:w="4320"/>
+            <w:tcW w:type="dxa" w:w="5256"/>
           </w:tcPr>
           <w:p>
             <w:r>
@@ -4973,13 +4989,13 @@
         <w:tblLook w:firstColumn="1" w:firstRow="1" w:lastColumn="0" w:lastRow="0" w:noHBand="0" w:noVBand="1" w:val="04A0"/>
       </w:tblPr>
       <w:tblGrid>
-        <w:gridCol w:w="4320"/>
-        <w:gridCol w:w="4320"/>
+        <w:gridCol w:w="5256"/>
+        <w:gridCol w:w="5256"/>
       </w:tblGrid>
       <w:tr>
         <w:tc>
           <w:tcPr>
-            <w:tcW w:type="dxa" w:w="4320"/>
+            <w:tcW w:type="dxa" w:w="5256"/>
             <w:vAlign w:val="center"/>
           </w:tcPr>
           <w:p>
@@ -4994,7 +5010,7 @@
         </w:tc>
         <w:tc>
           <w:tcPr>
-            <w:tcW w:type="dxa" w:w="4320"/>
+            <w:tcW w:type="dxa" w:w="5256"/>
             <w:vAlign w:val="center"/>
           </w:tcPr>
           <w:p>
@@ -5011,7 +5027,7 @@
       <w:tr>
         <w:tc>
           <w:tcPr>
-            <w:tcW w:type="dxa" w:w="4320"/>
+            <w:tcW w:type="dxa" w:w="5256"/>
           </w:tcPr>
           <w:p>
             <w:r>
@@ -5027,7 +5043,7 @@
         </w:tc>
         <w:tc>
           <w:tcPr>
-            <w:tcW w:type="dxa" w:w="4320"/>
+            <w:tcW w:type="dxa" w:w="5256"/>
           </w:tcPr>
           <w:p>
             <w:r>
@@ -5043,7 +5059,7 @@
       <w:tr>
         <w:tc>
           <w:tcPr>
-            <w:tcW w:type="dxa" w:w="4320"/>
+            <w:tcW w:type="dxa" w:w="5256"/>
           </w:tcPr>
           <w:p>
             <w:r>
@@ -5059,7 +5075,7 @@
         </w:tc>
         <w:tc>
           <w:tcPr>
-            <w:tcW w:type="dxa" w:w="4320"/>
+            <w:tcW w:type="dxa" w:w="5256"/>
           </w:tcPr>
           <w:p>
             <w:r>
@@ -5075,7 +5091,7 @@
       <w:tr>
         <w:tc>
           <w:tcPr>
-            <w:tcW w:type="dxa" w:w="4320"/>
+            <w:tcW w:type="dxa" w:w="5256"/>
           </w:tcPr>
           <w:p>
             <w:r>
@@ -5091,7 +5107,7 @@
         </w:tc>
         <w:tc>
           <w:tcPr>
-            <w:tcW w:type="dxa" w:w="4320"/>
+            <w:tcW w:type="dxa" w:w="5256"/>
           </w:tcPr>
           <w:p>
             <w:r>
@@ -5123,7 +5139,7 @@
       <w:tr>
         <w:tc>
           <w:tcPr>
-            <w:tcW w:type="dxa" w:w="4320"/>
+            <w:tcW w:type="dxa" w:w="5256"/>
           </w:tcPr>
           <w:p>
             <w:r>
@@ -5155,7 +5171,7 @@
         </w:tc>
         <w:tc>
           <w:tcPr>
-            <w:tcW w:type="dxa" w:w="4320"/>
+            <w:tcW w:type="dxa" w:w="5256"/>
           </w:tcPr>
           <w:p>
             <w:r>
@@ -6335,14 +6351,14 @@
         <w:tblLook w:firstColumn="1" w:firstRow="1" w:lastColumn="0" w:lastRow="0" w:noHBand="0" w:noVBand="1" w:val="04A0"/>
       </w:tblPr>
       <w:tblGrid>
-        <w:gridCol w:w="2880"/>
-        <w:gridCol w:w="2880"/>
-        <w:gridCol w:w="2880"/>
+        <w:gridCol w:w="3504"/>
+        <w:gridCol w:w="3504"/>
+        <w:gridCol w:w="3504"/>
       </w:tblGrid>
       <w:tr>
         <w:tc>
           <w:tcPr>
-            <w:tcW w:type="dxa" w:w="2880"/>
+            <w:tcW w:type="dxa" w:w="3504"/>
             <w:vAlign w:val="center"/>
           </w:tcPr>
           <w:p>
@@ -6357,7 +6373,7 @@
         </w:tc>
         <w:tc>
           <w:tcPr>
-            <w:tcW w:type="dxa" w:w="2880"/>
+            <w:tcW w:type="dxa" w:w="3504"/>
             <w:vAlign w:val="center"/>
           </w:tcPr>
           <w:p>
@@ -6372,7 +6388,7 @@
         </w:tc>
         <w:tc>
           <w:tcPr>
-            <w:tcW w:type="dxa" w:w="2880"/>
+            <w:tcW w:type="dxa" w:w="3504"/>
             <w:vAlign w:val="center"/>
           </w:tcPr>
           <w:p>
@@ -6389,7 +6405,7 @@
       <w:tr>
         <w:tc>
           <w:tcPr>
-            <w:tcW w:type="dxa" w:w="2880"/>
+            <w:tcW w:type="dxa" w:w="3504"/>
           </w:tcPr>
           <w:p>
             <w:r>
@@ -6405,7 +6421,7 @@
         </w:tc>
         <w:tc>
           <w:tcPr>
-            <w:tcW w:type="dxa" w:w="2880"/>
+            <w:tcW w:type="dxa" w:w="3504"/>
           </w:tcPr>
           <w:p>
             <w:r>
@@ -6444,7 +6460,7 @@
         </w:tc>
         <w:tc>
           <w:tcPr>
-            <w:tcW w:type="dxa" w:w="2880"/>
+            <w:tcW w:type="dxa" w:w="3504"/>
           </w:tcPr>
           <w:p>
             <w:r>
@@ -6460,7 +6476,7 @@
       <w:tr>
         <w:tc>
           <w:tcPr>
-            <w:tcW w:type="dxa" w:w="2880"/>
+            <w:tcW w:type="dxa" w:w="3504"/>
           </w:tcPr>
           <w:p>
             <w:r>
@@ -6476,7 +6492,7 @@
         </w:tc>
         <w:tc>
           <w:tcPr>
-            <w:tcW w:type="dxa" w:w="2880"/>
+            <w:tcW w:type="dxa" w:w="3504"/>
           </w:tcPr>
           <w:p>
             <w:r>
@@ -6508,7 +6524,7 @@
         </w:tc>
         <w:tc>
           <w:tcPr>
-            <w:tcW w:type="dxa" w:w="2880"/>
+            <w:tcW w:type="dxa" w:w="3504"/>
           </w:tcPr>
           <w:p>
             <w:r>
@@ -6526,7 +6542,7 @@
       <w:tr>
         <w:tc>
           <w:tcPr>
-            <w:tcW w:type="dxa" w:w="2880"/>
+            <w:tcW w:type="dxa" w:w="3504"/>
           </w:tcPr>
           <w:p>
             <w:r>
@@ -6542,7 +6558,7 @@
         </w:tc>
         <w:tc>
           <w:tcPr>
-            <w:tcW w:type="dxa" w:w="2880"/>
+            <w:tcW w:type="dxa" w:w="3504"/>
           </w:tcPr>
           <w:p>
             <w:r>
@@ -6581,7 +6597,7 @@
         </w:tc>
         <w:tc>
           <w:tcPr>
-            <w:tcW w:type="dxa" w:w="2880"/>
+            <w:tcW w:type="dxa" w:w="3504"/>
           </w:tcPr>
           <w:p>
             <w:r>
@@ -6882,15 +6898,15 @@
         <w:tblLook w:firstColumn="1" w:firstRow="1" w:lastColumn="0" w:lastRow="0" w:noHBand="0" w:noVBand="1" w:val="04A0"/>
       </w:tblPr>
       <w:tblGrid>
-        <w:gridCol w:w="2160"/>
-        <w:gridCol w:w="2160"/>
-        <w:gridCol w:w="2160"/>
-        <w:gridCol w:w="2160"/>
+        <w:gridCol w:w="2628"/>
+        <w:gridCol w:w="2628"/>
+        <w:gridCol w:w="2628"/>
+        <w:gridCol w:w="2628"/>
       </w:tblGrid>
       <w:tr>
         <w:tc>
           <w:tcPr>
-            <w:tcW w:type="dxa" w:w="2160"/>
+            <w:tcW w:type="dxa" w:w="2628"/>
             <w:vAlign w:val="center"/>
           </w:tcPr>
           <w:p>
@@ -6905,7 +6921,7 @@
         </w:tc>
         <w:tc>
           <w:tcPr>
-            <w:tcW w:type="dxa" w:w="2160"/>
+            <w:tcW w:type="dxa" w:w="2628"/>
             <w:vAlign w:val="center"/>
           </w:tcPr>
           <w:p>
@@ -6920,7 +6936,7 @@
         </w:tc>
         <w:tc>
           <w:tcPr>
-            <w:tcW w:type="dxa" w:w="2160"/>
+            <w:tcW w:type="dxa" w:w="2628"/>
             <w:vAlign w:val="center"/>
           </w:tcPr>
           <w:p>
@@ -6935,7 +6951,7 @@
         </w:tc>
         <w:tc>
           <w:tcPr>
-            <w:tcW w:type="dxa" w:w="2160"/>
+            <w:tcW w:type="dxa" w:w="2628"/>
             <w:vAlign w:val="center"/>
           </w:tcPr>
           <w:p>
@@ -6952,7 +6968,7 @@
       <w:tr>
         <w:tc>
           <w:tcPr>
-            <w:tcW w:type="dxa" w:w="2160"/>
+            <w:tcW w:type="dxa" w:w="2628"/>
           </w:tcPr>
           <w:p>
             <w:r>
@@ -6966,7 +6982,7 @@
         </w:tc>
         <w:tc>
           <w:tcPr>
-            <w:tcW w:type="dxa" w:w="2160"/>
+            <w:tcW w:type="dxa" w:w="2628"/>
           </w:tcPr>
           <w:p>
             <w:r>
@@ -6990,7 +7006,7 @@
         </w:tc>
         <w:tc>
           <w:tcPr>
-            <w:tcW w:type="dxa" w:w="2160"/>
+            <w:tcW w:type="dxa" w:w="2628"/>
           </w:tcPr>
           <w:p>
             <w:r>
@@ -7004,7 +7020,7 @@
         </w:tc>
         <w:tc>
           <w:tcPr>
-            <w:tcW w:type="dxa" w:w="2160"/>
+            <w:tcW w:type="dxa" w:w="2628"/>
           </w:tcPr>
           <w:p>
             <w:r>
@@ -7033,7 +7049,7 @@
       <w:tr>
         <w:tc>
           <w:tcPr>
-            <w:tcW w:type="dxa" w:w="2160"/>
+            <w:tcW w:type="dxa" w:w="2628"/>
           </w:tcPr>
           <w:p>
             <w:r>
@@ -7047,7 +7063,7 @@
         </w:tc>
         <w:tc>
           <w:tcPr>
-            <w:tcW w:type="dxa" w:w="2160"/>
+            <w:tcW w:type="dxa" w:w="2628"/>
           </w:tcPr>
           <w:p>
             <w:r>
@@ -7071,7 +7087,7 @@
         </w:tc>
         <w:tc>
           <w:tcPr>
-            <w:tcW w:type="dxa" w:w="2160"/>
+            <w:tcW w:type="dxa" w:w="2628"/>
           </w:tcPr>
           <w:p>
             <w:r>
@@ -7085,7 +7101,7 @@
         </w:tc>
         <w:tc>
           <w:tcPr>
-            <w:tcW w:type="dxa" w:w="2160"/>
+            <w:tcW w:type="dxa" w:w="2628"/>
           </w:tcPr>
           <w:p>
             <w:r>
@@ -7158,10 +7174,13 @@
       </w:r>
     </w:p>
     <w:p>
+      <w:pPr>
+        <w:jc w:val="center"/>
+      </w:pPr>
       <w:r>
         <w:drawing>
           <wp:inline xmlns:a="http://schemas.openxmlformats.org/drawingml/2006/main" xmlns:pic="http://schemas.openxmlformats.org/drawingml/2006/picture">
-            <wp:extent cx="5486400" cy="3810000"/>
+            <wp:extent cx="5943600" cy="4127500"/>
             <wp:docPr id="12" name="Picture 12"/>
             <wp:cNvGraphicFramePr>
               <a:graphicFrameLocks noChangeAspect="1"/>
@@ -7182,7 +7201,7 @@
                   <pic:spPr>
                     <a:xfrm>
                       <a:off x="0" y="0"/>
-                      <a:ext cx="5486400" cy="3810000"/>
+                      <a:ext cx="5943600" cy="4127500"/>
                     </a:xfrm>
                     <a:prstGeom prst="rect"/>
                   </pic:spPr>
@@ -7194,6 +7213,19 @@
       </w:r>
     </w:p>
     <w:p>
+      <w:pPr>
+        <w:jc w:val="center"/>
+      </w:pPr>
+      <w:r>
+        <w:rPr>
+          <w:i/>
+          <w:color w:val="555555"/>
+          <w:sz w:val="18"/>
+        </w:rPr>
+        <w:t>GitHub Actions — CI + CD green on main</w:t>
+      </w:r>
+    </w:p>
+    <w:p>
       <w:r>
         <w:rPr>
           <w:color w:val="CCCCCC"/>
@@ -7729,13 +7761,13 @@
         <w:tblLook w:firstColumn="1" w:firstRow="1" w:lastColumn="0" w:lastRow="0" w:noHBand="0" w:noVBand="1" w:val="04A0"/>
       </w:tblPr>
       <w:tblGrid>
-        <w:gridCol w:w="4320"/>
-        <w:gridCol w:w="4320"/>
+        <w:gridCol w:w="5256"/>
+        <w:gridCol w:w="5256"/>
       </w:tblGrid>
       <w:tr>
         <w:tc>
           <w:tcPr>
-            <w:tcW w:type="dxa" w:w="4320"/>
+            <w:tcW w:type="dxa" w:w="5256"/>
             <w:vAlign w:val="center"/>
           </w:tcPr>
           <w:p>
@@ -7750,7 +7782,7 @@
         </w:tc>
         <w:tc>
           <w:tcPr>
-            <w:tcW w:type="dxa" w:w="4320"/>
+            <w:tcW w:type="dxa" w:w="5256"/>
             <w:vAlign w:val="center"/>
           </w:tcPr>
           <w:p>
@@ -7767,7 +7799,7 @@
       <w:tr>
         <w:tc>
           <w:tcPr>
-            <w:tcW w:type="dxa" w:w="4320"/>
+            <w:tcW w:type="dxa" w:w="5256"/>
           </w:tcPr>
           <w:p>
             <w:r>
@@ -7781,7 +7813,7 @@
         </w:tc>
         <w:tc>
           <w:tcPr>
-            <w:tcW w:type="dxa" w:w="4320"/>
+            <w:tcW w:type="dxa" w:w="5256"/>
           </w:tcPr>
           <w:p>
             <w:r>
@@ -7799,7 +7831,7 @@
       <w:tr>
         <w:tc>
           <w:tcPr>
-            <w:tcW w:type="dxa" w:w="4320"/>
+            <w:tcW w:type="dxa" w:w="5256"/>
           </w:tcPr>
           <w:p>
             <w:r>
@@ -7813,7 +7845,7 @@
         </w:tc>
         <w:tc>
           <w:tcPr>
-            <w:tcW w:type="dxa" w:w="4320"/>
+            <w:tcW w:type="dxa" w:w="5256"/>
           </w:tcPr>
           <w:p>
             <w:r>
@@ -7863,7 +7895,7 @@
       <w:tr>
         <w:tc>
           <w:tcPr>
-            <w:tcW w:type="dxa" w:w="4320"/>
+            <w:tcW w:type="dxa" w:w="5256"/>
           </w:tcPr>
           <w:p>
             <w:r>
@@ -7877,7 +7909,7 @@
         </w:tc>
         <w:tc>
           <w:tcPr>
-            <w:tcW w:type="dxa" w:w="4320"/>
+            <w:tcW w:type="dxa" w:w="5256"/>
           </w:tcPr>
           <w:p>
             <w:r>
@@ -7893,7 +7925,7 @@
       <w:tr>
         <w:tc>
           <w:tcPr>
-            <w:tcW w:type="dxa" w:w="4320"/>
+            <w:tcW w:type="dxa" w:w="5256"/>
           </w:tcPr>
           <w:p>
             <w:r>
@@ -7907,7 +7939,7 @@
         </w:tc>
         <w:tc>
           <w:tcPr>
-            <w:tcW w:type="dxa" w:w="4320"/>
+            <w:tcW w:type="dxa" w:w="5256"/>
           </w:tcPr>
           <w:p>
             <w:r>
@@ -7923,7 +7955,7 @@
       <w:tr>
         <w:tc>
           <w:tcPr>
-            <w:tcW w:type="dxa" w:w="4320"/>
+            <w:tcW w:type="dxa" w:w="5256"/>
           </w:tcPr>
           <w:p>
             <w:r>
@@ -7937,7 +7969,7 @@
         </w:tc>
         <w:tc>
           <w:tcPr>
-            <w:tcW w:type="dxa" w:w="4320"/>
+            <w:tcW w:type="dxa" w:w="5256"/>
           </w:tcPr>
           <w:p>
             <w:r>
@@ -7955,7 +7987,7 @@
       <w:tr>
         <w:tc>
           <w:tcPr>
-            <w:tcW w:type="dxa" w:w="4320"/>
+            <w:tcW w:type="dxa" w:w="5256"/>
           </w:tcPr>
           <w:p>
             <w:r>
@@ -7969,7 +8001,7 @@
         </w:tc>
         <w:tc>
           <w:tcPr>
-            <w:tcW w:type="dxa" w:w="4320"/>
+            <w:tcW w:type="dxa" w:w="5256"/>
           </w:tcPr>
           <w:p>
             <w:r>
@@ -8145,13 +8177,13 @@
         <w:tblLook w:firstColumn="1" w:firstRow="1" w:lastColumn="0" w:lastRow="0" w:noHBand="0" w:noVBand="1" w:val="04A0"/>
       </w:tblPr>
       <w:tblGrid>
-        <w:gridCol w:w="4320"/>
-        <w:gridCol w:w="4320"/>
+        <w:gridCol w:w="5256"/>
+        <w:gridCol w:w="5256"/>
       </w:tblGrid>
       <w:tr>
         <w:tc>
           <w:tcPr>
-            <w:tcW w:type="dxa" w:w="4320"/>
+            <w:tcW w:type="dxa" w:w="5256"/>
             <w:vAlign w:val="center"/>
           </w:tcPr>
           <w:p>
@@ -8166,7 +8198,7 @@
         </w:tc>
         <w:tc>
           <w:tcPr>
-            <w:tcW w:type="dxa" w:w="4320"/>
+            <w:tcW w:type="dxa" w:w="5256"/>
             <w:vAlign w:val="center"/>
           </w:tcPr>
           <w:p>
@@ -8183,7 +8215,7 @@
       <w:tr>
         <w:tc>
           <w:tcPr>
-            <w:tcW w:type="dxa" w:w="4320"/>
+            <w:tcW w:type="dxa" w:w="5256"/>
           </w:tcPr>
           <w:p>
             <w:r>
@@ -8213,13 +8245,13 @@
         </w:tc>
         <w:tc>
           <w:tcPr>
-            <w:tcW w:type="dxa" w:w="4320"/>
+            <w:tcW w:type="dxa" w:w="5256"/>
           </w:tcPr>
           <w:p>
             <w:r>
               <w:drawing>
                 <wp:inline xmlns:a="http://schemas.openxmlformats.org/drawingml/2006/main" xmlns:pic="http://schemas.openxmlformats.org/drawingml/2006/picture">
-                  <wp:extent cx="5486400" cy="3857625"/>
+                  <wp:extent cx="2788920" cy="1960959"/>
                   <wp:docPr id="13" name="Picture 13"/>
                   <wp:cNvGraphicFramePr>
                     <a:graphicFrameLocks noChangeAspect="1"/>
@@ -8240,7 +8272,7 @@
                         <pic:spPr>
                           <a:xfrm>
                             <a:off x="0" y="0"/>
-                            <a:ext cx="5486400" cy="3857625"/>
+                            <a:ext cx="2788920" cy="1960959"/>
                           </a:xfrm>
                           <a:prstGeom prst="rect"/>
                         </pic:spPr>
@@ -8256,7 +8288,7 @@
       <w:tr>
         <w:tc>
           <w:tcPr>
-            <w:tcW w:type="dxa" w:w="4320"/>
+            <w:tcW w:type="dxa" w:w="5256"/>
           </w:tcPr>
           <w:p>
             <w:r>
@@ -8286,13 +8318,13 @@
         </w:tc>
         <w:tc>
           <w:tcPr>
-            <w:tcW w:type="dxa" w:w="4320"/>
+            <w:tcW w:type="dxa" w:w="5256"/>
           </w:tcPr>
           <w:p>
             <w:r>
               <w:drawing>
                 <wp:inline xmlns:a="http://schemas.openxmlformats.org/drawingml/2006/main" xmlns:pic="http://schemas.openxmlformats.org/drawingml/2006/picture">
-                  <wp:extent cx="5486400" cy="2998976"/>
+                  <wp:extent cx="2788920" cy="1524479"/>
                   <wp:docPr id="14" name="Picture 14"/>
                   <wp:cNvGraphicFramePr>
                     <a:graphicFrameLocks noChangeAspect="1"/>
@@ -8313,7 +8345,7 @@
                         <pic:spPr>
                           <a:xfrm>
                             <a:off x="0" y="0"/>
-                            <a:ext cx="5486400" cy="2998976"/>
+                            <a:ext cx="2788920" cy="1524479"/>
                           </a:xfrm>
                           <a:prstGeom prst="rect"/>
                         </pic:spPr>
@@ -8329,7 +8361,7 @@
       <w:tr>
         <w:tc>
           <w:tcPr>
-            <w:tcW w:type="dxa" w:w="4320"/>
+            <w:tcW w:type="dxa" w:w="5256"/>
           </w:tcPr>
           <w:p>
             <w:r>
@@ -8359,13 +8391,13 @@
         </w:tc>
         <w:tc>
           <w:tcPr>
-            <w:tcW w:type="dxa" w:w="4320"/>
+            <w:tcW w:type="dxa" w:w="5256"/>
           </w:tcPr>
           <w:p>
             <w:r>
               <w:drawing>
                 <wp:inline xmlns:a="http://schemas.openxmlformats.org/drawingml/2006/main" xmlns:pic="http://schemas.openxmlformats.org/drawingml/2006/picture">
-                  <wp:extent cx="5486400" cy="1014038"/>
+                  <wp:extent cx="2788920" cy="515469"/>
                   <wp:docPr id="15" name="Picture 15"/>
                   <wp:cNvGraphicFramePr>
                     <a:graphicFrameLocks noChangeAspect="1"/>
@@ -8386,7 +8418,7 @@
                         <pic:spPr>
                           <a:xfrm>
                             <a:off x="0" y="0"/>
-                            <a:ext cx="5486400" cy="1014038"/>
+                            <a:ext cx="2788920" cy="515469"/>
                           </a:xfrm>
                           <a:prstGeom prst="rect"/>
                         </pic:spPr>
@@ -8864,13 +8896,13 @@
         <w:tblLook w:firstColumn="1" w:firstRow="1" w:lastColumn="0" w:lastRow="0" w:noHBand="0" w:noVBand="1" w:val="04A0"/>
       </w:tblPr>
       <w:tblGrid>
-        <w:gridCol w:w="4320"/>
-        <w:gridCol w:w="4320"/>
+        <w:gridCol w:w="5256"/>
+        <w:gridCol w:w="5256"/>
       </w:tblGrid>
       <w:tr>
         <w:tc>
           <w:tcPr>
-            <w:tcW w:type="dxa" w:w="4320"/>
+            <w:tcW w:type="dxa" w:w="5256"/>
             <w:vAlign w:val="center"/>
           </w:tcPr>
           <w:p>
@@ -8885,7 +8917,7 @@
         </w:tc>
         <w:tc>
           <w:tcPr>
-            <w:tcW w:type="dxa" w:w="4320"/>
+            <w:tcW w:type="dxa" w:w="5256"/>
             <w:vAlign w:val="center"/>
           </w:tcPr>
           <w:p>
@@ -8902,7 +8934,7 @@
       <w:tr>
         <w:tc>
           <w:tcPr>
-            <w:tcW w:type="dxa" w:w="4320"/>
+            <w:tcW w:type="dxa" w:w="5256"/>
           </w:tcPr>
           <w:p>
             <w:r>
@@ -8918,7 +8950,7 @@
         </w:tc>
         <w:tc>
           <w:tcPr>
-            <w:tcW w:type="dxa" w:w="4320"/>
+            <w:tcW w:type="dxa" w:w="5256"/>
           </w:tcPr>
           <w:p>
             <w:r>
@@ -8943,7 +8975,7 @@
       <w:tr>
         <w:tc>
           <w:tcPr>
-            <w:tcW w:type="dxa" w:w="4320"/>
+            <w:tcW w:type="dxa" w:w="5256"/>
           </w:tcPr>
           <w:p>
             <w:r>
@@ -8959,7 +8991,7 @@
         </w:tc>
         <w:tc>
           <w:tcPr>
-            <w:tcW w:type="dxa" w:w="4320"/>
+            <w:tcW w:type="dxa" w:w="5256"/>
           </w:tcPr>
           <w:p>
             <w:r>
@@ -8975,7 +9007,7 @@
       <w:tr>
         <w:tc>
           <w:tcPr>
-            <w:tcW w:type="dxa" w:w="4320"/>
+            <w:tcW w:type="dxa" w:w="5256"/>
           </w:tcPr>
           <w:p>
             <w:r>
@@ -8991,7 +9023,7 @@
         </w:tc>
         <w:tc>
           <w:tcPr>
-            <w:tcW w:type="dxa" w:w="4320"/>
+            <w:tcW w:type="dxa" w:w="5256"/>
           </w:tcPr>
           <w:p>
             <w:r>
@@ -9032,7 +9064,7 @@
       <w:tr>
         <w:tc>
           <w:tcPr>
-            <w:tcW w:type="dxa" w:w="4320"/>
+            <w:tcW w:type="dxa" w:w="5256"/>
           </w:tcPr>
           <w:p>
             <w:r>
@@ -9048,7 +9080,7 @@
         </w:tc>
         <w:tc>
           <w:tcPr>
-            <w:tcW w:type="dxa" w:w="4320"/>
+            <w:tcW w:type="dxa" w:w="5256"/>
           </w:tcPr>
           <w:p>
             <w:r>
@@ -9073,7 +9105,7 @@
       <w:tr>
         <w:tc>
           <w:tcPr>
-            <w:tcW w:type="dxa" w:w="4320"/>
+            <w:tcW w:type="dxa" w:w="5256"/>
           </w:tcPr>
           <w:p>
             <w:r>
@@ -9089,7 +9121,7 @@
         </w:tc>
         <w:tc>
           <w:tcPr>
-            <w:tcW w:type="dxa" w:w="4320"/>
+            <w:tcW w:type="dxa" w:w="5256"/>
           </w:tcPr>
           <w:p>
             <w:r>
@@ -9114,7 +9146,7 @@
       <w:tr>
         <w:tc>
           <w:tcPr>
-            <w:tcW w:type="dxa" w:w="4320"/>
+            <w:tcW w:type="dxa" w:w="5256"/>
           </w:tcPr>
           <w:p>
             <w:r>
@@ -9130,7 +9162,7 @@
         </w:tc>
         <w:tc>
           <w:tcPr>
-            <w:tcW w:type="dxa" w:w="4320"/>
+            <w:tcW w:type="dxa" w:w="5256"/>
           </w:tcPr>
           <w:p>
             <w:r>
@@ -9678,13 +9710,13 @@
         <w:tblLook w:firstColumn="1" w:firstRow="1" w:lastColumn="0" w:lastRow="0" w:noHBand="0" w:noVBand="1" w:val="04A0"/>
       </w:tblPr>
       <w:tblGrid>
-        <w:gridCol w:w="4320"/>
-        <w:gridCol w:w="4320"/>
+        <w:gridCol w:w="5256"/>
+        <w:gridCol w:w="5256"/>
       </w:tblGrid>
       <w:tr>
         <w:tc>
           <w:tcPr>
-            <w:tcW w:type="dxa" w:w="4320"/>
+            <w:tcW w:type="dxa" w:w="5256"/>
             <w:vAlign w:val="center"/>
           </w:tcPr>
           <w:p>
@@ -9699,7 +9731,7 @@
         </w:tc>
         <w:tc>
           <w:tcPr>
-            <w:tcW w:type="dxa" w:w="4320"/>
+            <w:tcW w:type="dxa" w:w="5256"/>
             <w:vAlign w:val="center"/>
           </w:tcPr>
           <w:p>
@@ -9725,13 +9757,13 @@
       <w:tr>
         <w:tc>
           <w:tcPr>
-            <w:tcW w:type="dxa" w:w="4320"/>
+            <w:tcW w:type="dxa" w:w="5256"/>
           </w:tcPr>
           <w:p>
             <w:r>
               <w:drawing>
                 <wp:inline xmlns:a="http://schemas.openxmlformats.org/drawingml/2006/main" xmlns:pic="http://schemas.openxmlformats.org/drawingml/2006/picture">
-                  <wp:extent cx="5486400" cy="2194560"/>
+                  <wp:extent cx="2788920" cy="1115568"/>
                   <wp:docPr id="16" name="Picture 16"/>
                   <wp:cNvGraphicFramePr>
                     <a:graphicFrameLocks noChangeAspect="1"/>
@@ -9752,7 +9784,7 @@
                         <pic:spPr>
                           <a:xfrm>
                             <a:off x="0" y="0"/>
-                            <a:ext cx="5486400" cy="2194560"/>
+                            <a:ext cx="2788920" cy="1115568"/>
                           </a:xfrm>
                           <a:prstGeom prst="rect"/>
                         </pic:spPr>
@@ -9766,13 +9798,13 @@
         </w:tc>
         <w:tc>
           <w:tcPr>
-            <w:tcW w:type="dxa" w:w="4320"/>
+            <w:tcW w:type="dxa" w:w="5256"/>
           </w:tcPr>
           <w:p>
             <w:r>
               <w:drawing>
                 <wp:inline xmlns:a="http://schemas.openxmlformats.org/drawingml/2006/main" xmlns:pic="http://schemas.openxmlformats.org/drawingml/2006/picture">
-                  <wp:extent cx="5486400" cy="2482246"/>
+                  <wp:extent cx="2788920" cy="1261808"/>
                   <wp:docPr id="17" name="Picture 17"/>
                   <wp:cNvGraphicFramePr>
                     <a:graphicFrameLocks noChangeAspect="1"/>
@@ -9793,7 +9825,7 @@
                         <pic:spPr>
                           <a:xfrm>
                             <a:off x="0" y="0"/>
-                            <a:ext cx="5486400" cy="2482246"/>
+                            <a:ext cx="2788920" cy="1261808"/>
                           </a:xfrm>
                           <a:prstGeom prst="rect"/>
                         </pic:spPr>
@@ -10200,13 +10232,13 @@
         <w:tblLook w:firstColumn="1" w:firstRow="1" w:lastColumn="0" w:lastRow="0" w:noHBand="0" w:noVBand="1" w:val="04A0"/>
       </w:tblPr>
       <w:tblGrid>
-        <w:gridCol w:w="4320"/>
-        <w:gridCol w:w="4320"/>
+        <w:gridCol w:w="5256"/>
+        <w:gridCol w:w="5256"/>
       </w:tblGrid>
       <w:tr>
         <w:tc>
           <w:tcPr>
-            <w:tcW w:type="dxa" w:w="4320"/>
+            <w:tcW w:type="dxa" w:w="5256"/>
             <w:vAlign w:val="center"/>
           </w:tcPr>
           <w:p>
@@ -10221,7 +10253,7 @@
         </w:tc>
         <w:tc>
           <w:tcPr>
-            <w:tcW w:type="dxa" w:w="4320"/>
+            <w:tcW w:type="dxa" w:w="5256"/>
             <w:vAlign w:val="center"/>
           </w:tcPr>
           <w:p>
@@ -10238,7 +10270,7 @@
       <w:tr>
         <w:tc>
           <w:tcPr>
-            <w:tcW w:type="dxa" w:w="4320"/>
+            <w:tcW w:type="dxa" w:w="5256"/>
           </w:tcPr>
           <w:p>
             <w:r>
@@ -10254,7 +10286,7 @@
         </w:tc>
         <w:tc>
           <w:tcPr>
-            <w:tcW w:type="dxa" w:w="4320"/>
+            <w:tcW w:type="dxa" w:w="5256"/>
           </w:tcPr>
           <w:p>
             <w:r>
@@ -10279,7 +10311,7 @@
       <w:tr>
         <w:tc>
           <w:tcPr>
-            <w:tcW w:type="dxa" w:w="4320"/>
+            <w:tcW w:type="dxa" w:w="5256"/>
           </w:tcPr>
           <w:p>
             <w:r>
@@ -10295,7 +10327,7 @@
         </w:tc>
         <w:tc>
           <w:tcPr>
-            <w:tcW w:type="dxa" w:w="4320"/>
+            <w:tcW w:type="dxa" w:w="5256"/>
           </w:tcPr>
           <w:p>
             <w:r>
@@ -10320,7 +10352,7 @@
       <w:tr>
         <w:tc>
           <w:tcPr>
-            <w:tcW w:type="dxa" w:w="4320"/>
+            <w:tcW w:type="dxa" w:w="5256"/>
           </w:tcPr>
           <w:p>
             <w:r>
@@ -10336,7 +10368,7 @@
         </w:tc>
         <w:tc>
           <w:tcPr>
-            <w:tcW w:type="dxa" w:w="4320"/>
+            <w:tcW w:type="dxa" w:w="5256"/>
           </w:tcPr>
           <w:p>
             <w:r>
@@ -10352,7 +10384,7 @@
       <w:tr>
         <w:tc>
           <w:tcPr>
-            <w:tcW w:type="dxa" w:w="4320"/>
+            <w:tcW w:type="dxa" w:w="5256"/>
           </w:tcPr>
           <w:p>
             <w:r>
@@ -10368,7 +10400,7 @@
         </w:tc>
         <w:tc>
           <w:tcPr>
-            <w:tcW w:type="dxa" w:w="4320"/>
+            <w:tcW w:type="dxa" w:w="5256"/>
           </w:tcPr>
           <w:p>
             <w:r>
@@ -10400,7 +10432,7 @@
       <w:tr>
         <w:tc>
           <w:tcPr>
-            <w:tcW w:type="dxa" w:w="4320"/>
+            <w:tcW w:type="dxa" w:w="5256"/>
           </w:tcPr>
           <w:p>
             <w:r>
@@ -10416,7 +10448,7 @@
         </w:tc>
         <w:tc>
           <w:tcPr>
-            <w:tcW w:type="dxa" w:w="4320"/>
+            <w:tcW w:type="dxa" w:w="5256"/>
           </w:tcPr>
           <w:p>
             <w:r>
@@ -10441,7 +10473,7 @@
       <w:tr>
         <w:tc>
           <w:tcPr>
-            <w:tcW w:type="dxa" w:w="4320"/>
+            <w:tcW w:type="dxa" w:w="5256"/>
           </w:tcPr>
           <w:p>
             <w:r>
@@ -10457,7 +10489,7 @@
         </w:tc>
         <w:tc>
           <w:tcPr>
-            <w:tcW w:type="dxa" w:w="4320"/>
+            <w:tcW w:type="dxa" w:w="5256"/>
           </w:tcPr>
           <w:p>
             <w:r>
@@ -10514,7 +10546,7 @@
       <w:tr>
         <w:tc>
           <w:tcPr>
-            <w:tcW w:type="dxa" w:w="4320"/>
+            <w:tcW w:type="dxa" w:w="5256"/>
           </w:tcPr>
           <w:p>
             <w:r>
@@ -10530,7 +10562,7 @@
         </w:tc>
         <w:tc>
           <w:tcPr>
-            <w:tcW w:type="dxa" w:w="4320"/>
+            <w:tcW w:type="dxa" w:w="5256"/>
           </w:tcPr>
           <w:p>
             <w:r>
@@ -10986,15 +11018,15 @@
         <w:tblLook w:firstColumn="1" w:firstRow="1" w:lastColumn="0" w:lastRow="0" w:noHBand="0" w:noVBand="1" w:val="04A0"/>
       </w:tblPr>
       <w:tblGrid>
-        <w:gridCol w:w="2160"/>
-        <w:gridCol w:w="2160"/>
-        <w:gridCol w:w="2160"/>
-        <w:gridCol w:w="2160"/>
+        <w:gridCol w:w="2628"/>
+        <w:gridCol w:w="2628"/>
+        <w:gridCol w:w="2628"/>
+        <w:gridCol w:w="2628"/>
       </w:tblGrid>
       <w:tr>
         <w:tc>
           <w:tcPr>
-            <w:tcW w:type="dxa" w:w="2160"/>
+            <w:tcW w:type="dxa" w:w="2628"/>
             <w:vAlign w:val="center"/>
           </w:tcPr>
           <w:p>
@@ -11009,7 +11041,7 @@
         </w:tc>
         <w:tc>
           <w:tcPr>
-            <w:tcW w:type="dxa" w:w="2160"/>
+            <w:tcW w:type="dxa" w:w="2628"/>
             <w:vAlign w:val="center"/>
           </w:tcPr>
           <w:p>
@@ -11024,7 +11056,7 @@
         </w:tc>
         <w:tc>
           <w:tcPr>
-            <w:tcW w:type="dxa" w:w="2160"/>
+            <w:tcW w:type="dxa" w:w="2628"/>
             <w:vAlign w:val="center"/>
           </w:tcPr>
           <w:p>
@@ -11039,7 +11071,7 @@
         </w:tc>
         <w:tc>
           <w:tcPr>
-            <w:tcW w:type="dxa" w:w="2160"/>
+            <w:tcW w:type="dxa" w:w="2628"/>
             <w:vAlign w:val="center"/>
           </w:tcPr>
           <w:p>
@@ -11056,7 +11088,7 @@
       <w:tr>
         <w:tc>
           <w:tcPr>
-            <w:tcW w:type="dxa" w:w="2160"/>
+            <w:tcW w:type="dxa" w:w="2628"/>
           </w:tcPr>
           <w:p>
             <w:r>
@@ -11070,7 +11102,7 @@
         </w:tc>
         <w:tc>
           <w:tcPr>
-            <w:tcW w:type="dxa" w:w="2160"/>
+            <w:tcW w:type="dxa" w:w="2628"/>
           </w:tcPr>
           <w:p>
             <w:r>
@@ -11084,7 +11116,7 @@
         </w:tc>
         <w:tc>
           <w:tcPr>
-            <w:tcW w:type="dxa" w:w="2160"/>
+            <w:tcW w:type="dxa" w:w="2628"/>
           </w:tcPr>
           <w:p>
             <w:r>
@@ -11098,7 +11130,7 @@
         </w:tc>
         <w:tc>
           <w:tcPr>
-            <w:tcW w:type="dxa" w:w="2160"/>
+            <w:tcW w:type="dxa" w:w="2628"/>
           </w:tcPr>
           <w:p>
             <w:r>
@@ -11116,7 +11148,7 @@
       <w:tr>
         <w:tc>
           <w:tcPr>
-            <w:tcW w:type="dxa" w:w="2160"/>
+            <w:tcW w:type="dxa" w:w="2628"/>
           </w:tcPr>
           <w:p>
             <w:r>
@@ -11130,7 +11162,7 @@
         </w:tc>
         <w:tc>
           <w:tcPr>
-            <w:tcW w:type="dxa" w:w="2160"/>
+            <w:tcW w:type="dxa" w:w="2628"/>
           </w:tcPr>
           <w:p>
             <w:r>
@@ -11144,7 +11176,7 @@
         </w:tc>
         <w:tc>
           <w:tcPr>
-            <w:tcW w:type="dxa" w:w="2160"/>
+            <w:tcW w:type="dxa" w:w="2628"/>
           </w:tcPr>
           <w:p>
             <w:r>
@@ -11158,7 +11190,7 @@
         </w:tc>
         <w:tc>
           <w:tcPr>
-            <w:tcW w:type="dxa" w:w="2160"/>
+            <w:tcW w:type="dxa" w:w="2628"/>
           </w:tcPr>
           <w:p>
             <w:r>
@@ -11176,7 +11208,7 @@
       <w:tr>
         <w:tc>
           <w:tcPr>
-            <w:tcW w:type="dxa" w:w="2160"/>
+            <w:tcW w:type="dxa" w:w="2628"/>
           </w:tcPr>
           <w:p>
             <w:r>
@@ -11190,7 +11222,7 @@
         </w:tc>
         <w:tc>
           <w:tcPr>
-            <w:tcW w:type="dxa" w:w="2160"/>
+            <w:tcW w:type="dxa" w:w="2628"/>
           </w:tcPr>
           <w:p>
             <w:r>
@@ -11204,7 +11236,7 @@
         </w:tc>
         <w:tc>
           <w:tcPr>
-            <w:tcW w:type="dxa" w:w="2160"/>
+            <w:tcW w:type="dxa" w:w="2628"/>
           </w:tcPr>
           <w:p>
             <w:r>
@@ -11218,7 +11250,7 @@
         </w:tc>
         <w:tc>
           <w:tcPr>
-            <w:tcW w:type="dxa" w:w="2160"/>
+            <w:tcW w:type="dxa" w:w="2628"/>
           </w:tcPr>
           <w:p>
             <w:r>
@@ -11236,7 +11268,7 @@
       <w:tr>
         <w:tc>
           <w:tcPr>
-            <w:tcW w:type="dxa" w:w="2160"/>
+            <w:tcW w:type="dxa" w:w="2628"/>
           </w:tcPr>
           <w:p>
             <w:r>
@@ -11250,7 +11282,7 @@
         </w:tc>
         <w:tc>
           <w:tcPr>
-            <w:tcW w:type="dxa" w:w="2160"/>
+            <w:tcW w:type="dxa" w:w="2628"/>
           </w:tcPr>
           <w:p>
             <w:r>
@@ -11264,7 +11296,7 @@
         </w:tc>
         <w:tc>
           <w:tcPr>
-            <w:tcW w:type="dxa" w:w="2160"/>
+            <w:tcW w:type="dxa" w:w="2628"/>
           </w:tcPr>
           <w:p>
             <w:r>
@@ -11278,7 +11310,7 @@
         </w:tc>
         <w:tc>
           <w:tcPr>
-            <w:tcW w:type="dxa" w:w="2160"/>
+            <w:tcW w:type="dxa" w:w="2628"/>
           </w:tcPr>
           <w:p>
             <w:r>
@@ -11296,7 +11328,7 @@
       <w:tr>
         <w:tc>
           <w:tcPr>
-            <w:tcW w:type="dxa" w:w="2160"/>
+            <w:tcW w:type="dxa" w:w="2628"/>
           </w:tcPr>
           <w:p>
             <w:r>
@@ -11310,7 +11342,7 @@
         </w:tc>
         <w:tc>
           <w:tcPr>
-            <w:tcW w:type="dxa" w:w="2160"/>
+            <w:tcW w:type="dxa" w:w="2628"/>
           </w:tcPr>
           <w:p>
             <w:r>
@@ -11324,7 +11356,7 @@
         </w:tc>
         <w:tc>
           <w:tcPr>
-            <w:tcW w:type="dxa" w:w="2160"/>
+            <w:tcW w:type="dxa" w:w="2628"/>
           </w:tcPr>
           <w:p>
             <w:r>
@@ -11338,7 +11370,7 @@
         </w:tc>
         <w:tc>
           <w:tcPr>
-            <w:tcW w:type="dxa" w:w="2160"/>
+            <w:tcW w:type="dxa" w:w="2628"/>
           </w:tcPr>
           <w:p>
             <w:r>
@@ -11356,7 +11388,7 @@
       <w:tr>
         <w:tc>
           <w:tcPr>
-            <w:tcW w:type="dxa" w:w="2160"/>
+            <w:tcW w:type="dxa" w:w="2628"/>
           </w:tcPr>
           <w:p>
             <w:r>
@@ -11370,7 +11402,7 @@
         </w:tc>
         <w:tc>
           <w:tcPr>
-            <w:tcW w:type="dxa" w:w="2160"/>
+            <w:tcW w:type="dxa" w:w="2628"/>
           </w:tcPr>
           <w:p>
             <w:r>
@@ -11384,7 +11416,7 @@
         </w:tc>
         <w:tc>
           <w:tcPr>
-            <w:tcW w:type="dxa" w:w="2160"/>
+            <w:tcW w:type="dxa" w:w="2628"/>
           </w:tcPr>
           <w:p>
             <w:r>
@@ -11398,7 +11430,7 @@
         </w:tc>
         <w:tc>
           <w:tcPr>
-            <w:tcW w:type="dxa" w:w="2160"/>
+            <w:tcW w:type="dxa" w:w="2628"/>
           </w:tcPr>
           <w:p>
             <w:r>
@@ -11416,7 +11448,7 @@
       <w:tr>
         <w:tc>
           <w:tcPr>
-            <w:tcW w:type="dxa" w:w="2160"/>
+            <w:tcW w:type="dxa" w:w="2628"/>
           </w:tcPr>
           <w:p>
             <w:r>
@@ -11430,7 +11462,7 @@
         </w:tc>
         <w:tc>
           <w:tcPr>
-            <w:tcW w:type="dxa" w:w="2160"/>
+            <w:tcW w:type="dxa" w:w="2628"/>
           </w:tcPr>
           <w:p>
             <w:r>
@@ -11444,7 +11476,7 @@
         </w:tc>
         <w:tc>
           <w:tcPr>
-            <w:tcW w:type="dxa" w:w="2160"/>
+            <w:tcW w:type="dxa" w:w="2628"/>
           </w:tcPr>
           <w:p>
             <w:r>
@@ -11458,7 +11490,7 @@
         </w:tc>
         <w:tc>
           <w:tcPr>
-            <w:tcW w:type="dxa" w:w="2160"/>
+            <w:tcW w:type="dxa" w:w="2628"/>
           </w:tcPr>
           <w:p>
             <w:r>
@@ -11476,7 +11508,7 @@
       <w:tr>
         <w:tc>
           <w:tcPr>
-            <w:tcW w:type="dxa" w:w="2160"/>
+            <w:tcW w:type="dxa" w:w="2628"/>
           </w:tcPr>
           <w:p>
             <w:r>
@@ -11490,7 +11522,7 @@
         </w:tc>
         <w:tc>
           <w:tcPr>
-            <w:tcW w:type="dxa" w:w="2160"/>
+            <w:tcW w:type="dxa" w:w="2628"/>
           </w:tcPr>
           <w:p>
             <w:r>
@@ -11504,7 +11536,7 @@
         </w:tc>
         <w:tc>
           <w:tcPr>
-            <w:tcW w:type="dxa" w:w="2160"/>
+            <w:tcW w:type="dxa" w:w="2628"/>
           </w:tcPr>
           <w:p>
             <w:r>
@@ -11518,7 +11550,7 @@
         </w:tc>
         <w:tc>
           <w:tcPr>
-            <w:tcW w:type="dxa" w:w="2160"/>
+            <w:tcW w:type="dxa" w:w="2628"/>
           </w:tcPr>
           <w:p>
             <w:r>
@@ -11536,7 +11568,7 @@
       <w:tr>
         <w:tc>
           <w:tcPr>
-            <w:tcW w:type="dxa" w:w="2160"/>
+            <w:tcW w:type="dxa" w:w="2628"/>
           </w:tcPr>
           <w:p>
             <w:r>
@@ -11550,7 +11582,7 @@
         </w:tc>
         <w:tc>
           <w:tcPr>
-            <w:tcW w:type="dxa" w:w="2160"/>
+            <w:tcW w:type="dxa" w:w="2628"/>
           </w:tcPr>
           <w:p>
             <w:r>
@@ -11564,7 +11596,7 @@
         </w:tc>
         <w:tc>
           <w:tcPr>
-            <w:tcW w:type="dxa" w:w="2160"/>
+            <w:tcW w:type="dxa" w:w="2628"/>
           </w:tcPr>
           <w:p>
             <w:r>
@@ -11578,7 +11610,7 @@
         </w:tc>
         <w:tc>
           <w:tcPr>
-            <w:tcW w:type="dxa" w:w="2160"/>
+            <w:tcW w:type="dxa" w:w="2628"/>
           </w:tcPr>
           <w:p>
             <w:r>
@@ -11624,14 +11656,14 @@
         <w:tblLook w:firstColumn="1" w:firstRow="1" w:lastColumn="0" w:lastRow="0" w:noHBand="0" w:noVBand="1" w:val="04A0"/>
       </w:tblPr>
       <w:tblGrid>
-        <w:gridCol w:w="2880"/>
-        <w:gridCol w:w="2880"/>
-        <w:gridCol w:w="2880"/>
+        <w:gridCol w:w="3504"/>
+        <w:gridCol w:w="3504"/>
+        <w:gridCol w:w="3504"/>
       </w:tblGrid>
       <w:tr>
         <w:tc>
           <w:tcPr>
-            <w:tcW w:type="dxa" w:w="2880"/>
+            <w:tcW w:type="dxa" w:w="3504"/>
             <w:vAlign w:val="center"/>
           </w:tcPr>
           <w:p>
@@ -11646,7 +11678,7 @@
         </w:tc>
         <w:tc>
           <w:tcPr>
-            <w:tcW w:type="dxa" w:w="2880"/>
+            <w:tcW w:type="dxa" w:w="3504"/>
             <w:vAlign w:val="center"/>
           </w:tcPr>
           <w:p>
@@ -11661,7 +11693,7 @@
         </w:tc>
         <w:tc>
           <w:tcPr>
-            <w:tcW w:type="dxa" w:w="2880"/>
+            <w:tcW w:type="dxa" w:w="3504"/>
             <w:vAlign w:val="center"/>
           </w:tcPr>
           <w:p>
@@ -11678,7 +11710,7 @@
       <w:tr>
         <w:tc>
           <w:tcPr>
-            <w:tcW w:type="dxa" w:w="2880"/>
+            <w:tcW w:type="dxa" w:w="3504"/>
           </w:tcPr>
           <w:p>
             <w:r>
@@ -11692,7 +11724,7 @@
         </w:tc>
         <w:tc>
           <w:tcPr>
-            <w:tcW w:type="dxa" w:w="2880"/>
+            <w:tcW w:type="dxa" w:w="3504"/>
           </w:tcPr>
           <w:p>
             <w:r>
@@ -11722,7 +11754,7 @@
         </w:tc>
         <w:tc>
           <w:tcPr>
-            <w:tcW w:type="dxa" w:w="2880"/>
+            <w:tcW w:type="dxa" w:w="3504"/>
           </w:tcPr>
           <w:p>
             <w:r>
@@ -11755,7 +11787,7 @@
       <w:tr>
         <w:tc>
           <w:tcPr>
-            <w:tcW w:type="dxa" w:w="2880"/>
+            <w:tcW w:type="dxa" w:w="3504"/>
           </w:tcPr>
           <w:p>
             <w:r>
@@ -11769,7 +11801,7 @@
         </w:tc>
         <w:tc>
           <w:tcPr>
-            <w:tcW w:type="dxa" w:w="2880"/>
+            <w:tcW w:type="dxa" w:w="3504"/>
           </w:tcPr>
           <w:p>
             <w:r>
@@ -11792,7 +11824,7 @@
         </w:tc>
         <w:tc>
           <w:tcPr>
-            <w:tcW w:type="dxa" w:w="2880"/>
+            <w:tcW w:type="dxa" w:w="3504"/>
           </w:tcPr>
           <w:p>
             <w:r>
@@ -11809,7 +11841,7 @@
       <w:tr>
         <w:tc>
           <w:tcPr>
-            <w:tcW w:type="dxa" w:w="2880"/>
+            <w:tcW w:type="dxa" w:w="3504"/>
           </w:tcPr>
           <w:p>
             <w:r>
@@ -11823,7 +11855,7 @@
         </w:tc>
         <w:tc>
           <w:tcPr>
-            <w:tcW w:type="dxa" w:w="2880"/>
+            <w:tcW w:type="dxa" w:w="3504"/>
           </w:tcPr>
           <w:p>
             <w:r>
@@ -11846,7 +11878,7 @@
         </w:tc>
         <w:tc>
           <w:tcPr>
-            <w:tcW w:type="dxa" w:w="2880"/>
+            <w:tcW w:type="dxa" w:w="3504"/>
           </w:tcPr>
           <w:p>
             <w:r>
@@ -11863,7 +11895,7 @@
       <w:tr>
         <w:tc>
           <w:tcPr>
-            <w:tcW w:type="dxa" w:w="2880"/>
+            <w:tcW w:type="dxa" w:w="3504"/>
           </w:tcPr>
           <w:p>
             <w:r>
@@ -11877,7 +11909,7 @@
         </w:tc>
         <w:tc>
           <w:tcPr>
-            <w:tcW w:type="dxa" w:w="2880"/>
+            <w:tcW w:type="dxa" w:w="3504"/>
           </w:tcPr>
           <w:p>
             <w:r>
@@ -11900,7 +11932,7 @@
         </w:tc>
         <w:tc>
           <w:tcPr>
-            <w:tcW w:type="dxa" w:w="2880"/>
+            <w:tcW w:type="dxa" w:w="3504"/>
           </w:tcPr>
           <w:p>
             <w:r>
@@ -12050,14 +12082,14 @@
         <w:tblLook w:firstColumn="1" w:firstRow="1" w:lastColumn="0" w:lastRow="0" w:noHBand="0" w:noVBand="1" w:val="04A0"/>
       </w:tblPr>
       <w:tblGrid>
-        <w:gridCol w:w="2880"/>
-        <w:gridCol w:w="2880"/>
-        <w:gridCol w:w="2880"/>
+        <w:gridCol w:w="3504"/>
+        <w:gridCol w:w="3504"/>
+        <w:gridCol w:w="3504"/>
       </w:tblGrid>
       <w:tr>
         <w:tc>
           <w:tcPr>
-            <w:tcW w:type="dxa" w:w="2880"/>
+            <w:tcW w:type="dxa" w:w="3504"/>
             <w:vAlign w:val="center"/>
           </w:tcPr>
           <w:p>
@@ -12072,7 +12104,7 @@
         </w:tc>
         <w:tc>
           <w:tcPr>
-            <w:tcW w:type="dxa" w:w="2880"/>
+            <w:tcW w:type="dxa" w:w="3504"/>
             <w:vAlign w:val="center"/>
           </w:tcPr>
           <w:p>
@@ -12087,7 +12119,7 @@
         </w:tc>
         <w:tc>
           <w:tcPr>
-            <w:tcW w:type="dxa" w:w="2880"/>
+            <w:tcW w:type="dxa" w:w="3504"/>
             <w:vAlign w:val="center"/>
           </w:tcPr>
           <w:p>
@@ -12104,7 +12136,7 @@
       <w:tr>
         <w:tc>
           <w:tcPr>
-            <w:tcW w:type="dxa" w:w="2880"/>
+            <w:tcW w:type="dxa" w:w="3504"/>
           </w:tcPr>
           <w:p>
             <w:r>
@@ -12118,7 +12150,7 @@
         </w:tc>
         <w:tc>
           <w:tcPr>
-            <w:tcW w:type="dxa" w:w="2880"/>
+            <w:tcW w:type="dxa" w:w="3504"/>
           </w:tcPr>
           <w:p>
             <w:r>
@@ -12157,7 +12189,7 @@
         </w:tc>
         <w:tc>
           <w:tcPr>
-            <w:tcW w:type="dxa" w:w="2880"/>
+            <w:tcW w:type="dxa" w:w="3504"/>
           </w:tcPr>
           <w:p>
             <w:r>
@@ -12175,7 +12207,7 @@
       <w:tr>
         <w:tc>
           <w:tcPr>
-            <w:tcW w:type="dxa" w:w="2880"/>
+            <w:tcW w:type="dxa" w:w="3504"/>
           </w:tcPr>
           <w:p>
             <w:r>
@@ -12189,7 +12221,7 @@
         </w:tc>
         <w:tc>
           <w:tcPr>
-            <w:tcW w:type="dxa" w:w="2880"/>
+            <w:tcW w:type="dxa" w:w="3504"/>
           </w:tcPr>
           <w:p>
             <w:r>
@@ -12219,7 +12251,7 @@
         </w:tc>
         <w:tc>
           <w:tcPr>
-            <w:tcW w:type="dxa" w:w="2880"/>
+            <w:tcW w:type="dxa" w:w="3504"/>
           </w:tcPr>
           <w:p>
             <w:r>
@@ -12237,7 +12269,7 @@
       <w:tr>
         <w:tc>
           <w:tcPr>
-            <w:tcW w:type="dxa" w:w="2880"/>
+            <w:tcW w:type="dxa" w:w="3504"/>
           </w:tcPr>
           <w:p>
             <w:r>
@@ -12251,7 +12283,7 @@
         </w:tc>
         <w:tc>
           <w:tcPr>
-            <w:tcW w:type="dxa" w:w="2880"/>
+            <w:tcW w:type="dxa" w:w="3504"/>
           </w:tcPr>
           <w:p>
             <w:r>
@@ -12265,7 +12297,7 @@
         </w:tc>
         <w:tc>
           <w:tcPr>
-            <w:tcW w:type="dxa" w:w="2880"/>
+            <w:tcW w:type="dxa" w:w="3504"/>
           </w:tcPr>
           <w:p>
             <w:r>
@@ -12283,7 +12315,7 @@
       <w:tr>
         <w:tc>
           <w:tcPr>
-            <w:tcW w:type="dxa" w:w="2880"/>
+            <w:tcW w:type="dxa" w:w="3504"/>
           </w:tcPr>
           <w:p>
             <w:r>
@@ -12297,7 +12329,7 @@
         </w:tc>
         <w:tc>
           <w:tcPr>
-            <w:tcW w:type="dxa" w:w="2880"/>
+            <w:tcW w:type="dxa" w:w="3504"/>
           </w:tcPr>
           <w:p>
             <w:r>
@@ -12311,7 +12343,7 @@
         </w:tc>
         <w:tc>
           <w:tcPr>
-            <w:tcW w:type="dxa" w:w="2880"/>
+            <w:tcW w:type="dxa" w:w="3504"/>
           </w:tcPr>
           <w:p>
             <w:r>
@@ -12329,7 +12361,7 @@
       <w:tr>
         <w:tc>
           <w:tcPr>
-            <w:tcW w:type="dxa" w:w="2880"/>
+            <w:tcW w:type="dxa" w:w="3504"/>
           </w:tcPr>
           <w:p>
             <w:r>
@@ -12343,7 +12375,7 @@
         </w:tc>
         <w:tc>
           <w:tcPr>
-            <w:tcW w:type="dxa" w:w="2880"/>
+            <w:tcW w:type="dxa" w:w="3504"/>
           </w:tcPr>
           <w:p>
             <w:r>
@@ -12373,7 +12405,7 @@
         </w:tc>
         <w:tc>
           <w:tcPr>
-            <w:tcW w:type="dxa" w:w="2880"/>
+            <w:tcW w:type="dxa" w:w="3504"/>
           </w:tcPr>
           <w:p>
             <w:r>
@@ -12391,10 +12423,13 @@
     </w:tbl>
     <w:p/>
     <w:p>
+      <w:pPr>
+        <w:jc w:val="center"/>
+      </w:pPr>
       <w:r>
         <w:drawing>
           <wp:inline xmlns:a="http://schemas.openxmlformats.org/drawingml/2006/main" xmlns:pic="http://schemas.openxmlformats.org/drawingml/2006/picture">
-            <wp:extent cx="5486400" cy="3933405"/>
+            <wp:extent cx="5943600" cy="4261188"/>
             <wp:docPr id="18" name="Picture 18"/>
             <wp:cNvGraphicFramePr>
               <a:graphicFrameLocks noChangeAspect="1"/>
@@ -12415,7 +12450,7 @@
                   <pic:spPr>
                     <a:xfrm>
                       <a:off x="0" y="0"/>
-                      <a:ext cx="5486400" cy="3933405"/>
+                      <a:ext cx="5943600" cy="4261188"/>
                     </a:xfrm>
                     <a:prstGeom prst="rect"/>
                   </pic:spPr>
@@ -12428,6 +12463,19 @@
     </w:p>
     <w:p>
       <w:pPr>
+        <w:jc w:val="center"/>
+      </w:pPr>
+      <w:r>
+        <w:rPr>
+          <w:i/>
+          <w:color w:val="555555"/>
+          <w:sz w:val="18"/>
+        </w:rPr>
+        <w:t>Grafana dashboard</w:t>
+      </w:r>
+    </w:p>
+    <w:p>
+      <w:pPr>
         <w:ind w:left="432"/>
       </w:pPr>
       <w:r>
@@ -12656,14 +12704,14 @@
         <w:tblLook w:firstColumn="1" w:firstRow="1" w:lastColumn="0" w:lastRow="0" w:noHBand="0" w:noVBand="1" w:val="04A0"/>
       </w:tblPr>
       <w:tblGrid>
-        <w:gridCol w:w="2880"/>
-        <w:gridCol w:w="2880"/>
-        <w:gridCol w:w="2880"/>
+        <w:gridCol w:w="3504"/>
+        <w:gridCol w:w="3504"/>
+        <w:gridCol w:w="3504"/>
       </w:tblGrid>
       <w:tr>
         <w:tc>
           <w:tcPr>
-            <w:tcW w:type="dxa" w:w="2880"/>
+            <w:tcW w:type="dxa" w:w="3504"/>
             <w:vAlign w:val="center"/>
           </w:tcPr>
           <w:p>
@@ -12678,7 +12726,7 @@
         </w:tc>
         <w:tc>
           <w:tcPr>
-            <w:tcW w:type="dxa" w:w="2880"/>
+            <w:tcW w:type="dxa" w:w="3504"/>
             <w:vAlign w:val="center"/>
           </w:tcPr>
           <w:p>
@@ -12693,7 +12741,7 @@
         </w:tc>
         <w:tc>
           <w:tcPr>
-            <w:tcW w:type="dxa" w:w="2880"/>
+            <w:tcW w:type="dxa" w:w="3504"/>
             <w:vAlign w:val="center"/>
           </w:tcPr>
           <w:p>
@@ -12710,7 +12758,7 @@
       <w:tr>
         <w:tc>
           <w:tcPr>
-            <w:tcW w:type="dxa" w:w="2880"/>
+            <w:tcW w:type="dxa" w:w="3504"/>
           </w:tcPr>
           <w:p>
             <w:r>
@@ -12726,7 +12774,7 @@
         </w:tc>
         <w:tc>
           <w:tcPr>
-            <w:tcW w:type="dxa" w:w="2880"/>
+            <w:tcW w:type="dxa" w:w="3504"/>
           </w:tcPr>
           <w:p>
             <w:r>
@@ -12740,7 +12788,7 @@
         </w:tc>
         <w:tc>
           <w:tcPr>
-            <w:tcW w:type="dxa" w:w="2880"/>
+            <w:tcW w:type="dxa" w:w="3504"/>
           </w:tcPr>
           <w:p>
             <w:r>
@@ -12756,7 +12804,7 @@
       <w:tr>
         <w:tc>
           <w:tcPr>
-            <w:tcW w:type="dxa" w:w="2880"/>
+            <w:tcW w:type="dxa" w:w="3504"/>
           </w:tcPr>
           <w:p>
             <w:r>
@@ -12772,7 +12820,7 @@
         </w:tc>
         <w:tc>
           <w:tcPr>
-            <w:tcW w:type="dxa" w:w="2880"/>
+            <w:tcW w:type="dxa" w:w="3504"/>
           </w:tcPr>
           <w:p>
             <w:r>
@@ -12786,7 +12834,7 @@
         </w:tc>
         <w:tc>
           <w:tcPr>
-            <w:tcW w:type="dxa" w:w="2880"/>
+            <w:tcW w:type="dxa" w:w="3504"/>
           </w:tcPr>
           <w:p>
             <w:r>
@@ -12802,7 +12850,7 @@
       <w:tr>
         <w:tc>
           <w:tcPr>
-            <w:tcW w:type="dxa" w:w="2880"/>
+            <w:tcW w:type="dxa" w:w="3504"/>
           </w:tcPr>
           <w:p>
             <w:r>
@@ -12818,7 +12866,7 @@
         </w:tc>
         <w:tc>
           <w:tcPr>
-            <w:tcW w:type="dxa" w:w="2880"/>
+            <w:tcW w:type="dxa" w:w="3504"/>
           </w:tcPr>
           <w:p>
             <w:r>
@@ -12848,7 +12896,7 @@
         </w:tc>
         <w:tc>
           <w:tcPr>
-            <w:tcW w:type="dxa" w:w="2880"/>
+            <w:tcW w:type="dxa" w:w="3504"/>
           </w:tcPr>
           <w:p>
             <w:r>
@@ -12873,7 +12921,7 @@
       <w:tr>
         <w:tc>
           <w:tcPr>
-            <w:tcW w:type="dxa" w:w="2880"/>
+            <w:tcW w:type="dxa" w:w="3504"/>
           </w:tcPr>
           <w:p>
             <w:r>
@@ -12889,7 +12937,7 @@
         </w:tc>
         <w:tc>
           <w:tcPr>
-            <w:tcW w:type="dxa" w:w="2880"/>
+            <w:tcW w:type="dxa" w:w="3504"/>
           </w:tcPr>
           <w:p>
             <w:r>
@@ -12919,7 +12967,7 @@
         </w:tc>
         <w:tc>
           <w:tcPr>
-            <w:tcW w:type="dxa" w:w="2880"/>
+            <w:tcW w:type="dxa" w:w="3504"/>
           </w:tcPr>
           <w:p>
             <w:r>
@@ -12944,7 +12992,7 @@
       <w:tr>
         <w:tc>
           <w:tcPr>
-            <w:tcW w:type="dxa" w:w="2880"/>
+            <w:tcW w:type="dxa" w:w="3504"/>
           </w:tcPr>
           <w:p>
             <w:r>
@@ -12960,7 +13008,7 @@
         </w:tc>
         <w:tc>
           <w:tcPr>
-            <w:tcW w:type="dxa" w:w="2880"/>
+            <w:tcW w:type="dxa" w:w="3504"/>
           </w:tcPr>
           <w:p>
             <w:r>
@@ -12974,7 +13022,7 @@
         </w:tc>
         <w:tc>
           <w:tcPr>
-            <w:tcW w:type="dxa" w:w="2880"/>
+            <w:tcW w:type="dxa" w:w="3504"/>
           </w:tcPr>
           <w:p>
             <w:r>
@@ -12990,7 +13038,7 @@
       <w:tr>
         <w:tc>
           <w:tcPr>
-            <w:tcW w:type="dxa" w:w="2880"/>
+            <w:tcW w:type="dxa" w:w="3504"/>
           </w:tcPr>
           <w:p>
             <w:r>
@@ -13006,7 +13054,7 @@
         </w:tc>
         <w:tc>
           <w:tcPr>
-            <w:tcW w:type="dxa" w:w="2880"/>
+            <w:tcW w:type="dxa" w:w="3504"/>
           </w:tcPr>
           <w:p>
             <w:r>
@@ -13020,7 +13068,7 @@
         </w:tc>
         <w:tc>
           <w:tcPr>
-            <w:tcW w:type="dxa" w:w="2880"/>
+            <w:tcW w:type="dxa" w:w="3504"/>
           </w:tcPr>
           <w:p>
             <w:r>
@@ -13036,10 +13084,13 @@
     </w:tbl>
     <w:p/>
     <w:p>
+      <w:pPr>
+        <w:jc w:val="center"/>
+      </w:pPr>
       <w:r>
         <w:drawing>
           <wp:inline xmlns:a="http://schemas.openxmlformats.org/drawingml/2006/main" xmlns:pic="http://schemas.openxmlformats.org/drawingml/2006/picture">
-            <wp:extent cx="5486400" cy="4714875"/>
+            <wp:extent cx="5943600" cy="5107781"/>
             <wp:docPr id="19" name="Picture 19"/>
             <wp:cNvGraphicFramePr>
               <a:graphicFrameLocks noChangeAspect="1"/>
@@ -13060,7 +13111,7 @@
                   <pic:spPr>
                     <a:xfrm>
                       <a:off x="0" y="0"/>
-                      <a:ext cx="5486400" cy="4714875"/>
+                      <a:ext cx="5943600" cy="5107781"/>
                     </a:xfrm>
                     <a:prstGeom prst="rect"/>
                   </pic:spPr>
@@ -13073,6 +13124,19 @@
     </w:p>
     <w:p>
       <w:pPr>
+        <w:jc w:val="center"/>
+      </w:pPr>
+      <w:r>
+        <w:rPr>
+          <w:i/>
+          <w:color w:val="555555"/>
+          <w:sz w:val="18"/>
+        </w:rPr>
+        <w:t>Swagger UI — auto-generated from Pydantic schemas</w:t>
+      </w:r>
+    </w:p>
+    <w:p>
+      <w:pPr>
         <w:pStyle w:val="Heading3"/>
         <w:jc w:val="left"/>
       </w:pPr>
@@ -13895,15 +13959,15 @@
         <w:tblLook w:firstColumn="1" w:firstRow="1" w:lastColumn="0" w:lastRow="0" w:noHBand="0" w:noVBand="1" w:val="04A0"/>
       </w:tblPr>
       <w:tblGrid>
-        <w:gridCol w:w="2160"/>
-        <w:gridCol w:w="2160"/>
-        <w:gridCol w:w="2160"/>
-        <w:gridCol w:w="2160"/>
+        <w:gridCol w:w="2628"/>
+        <w:gridCol w:w="2628"/>
+        <w:gridCol w:w="2628"/>
+        <w:gridCol w:w="2628"/>
       </w:tblGrid>
       <w:tr>
         <w:tc>
           <w:tcPr>
-            <w:tcW w:type="dxa" w:w="2160"/>
+            <w:tcW w:type="dxa" w:w="2628"/>
             <w:vAlign w:val="center"/>
           </w:tcPr>
           <w:p>
@@ -13918,7 +13982,7 @@
         </w:tc>
         <w:tc>
           <w:tcPr>
-            <w:tcW w:type="dxa" w:w="2160"/>
+            <w:tcW w:type="dxa" w:w="2628"/>
             <w:vAlign w:val="center"/>
           </w:tcPr>
           <w:p>
@@ -13933,7 +13997,7 @@
         </w:tc>
         <w:tc>
           <w:tcPr>
-            <w:tcW w:type="dxa" w:w="2160"/>
+            <w:tcW w:type="dxa" w:w="2628"/>
             <w:vAlign w:val="center"/>
           </w:tcPr>
           <w:p>
@@ -13948,7 +14012,7 @@
         </w:tc>
         <w:tc>
           <w:tcPr>
-            <w:tcW w:type="dxa" w:w="2160"/>
+            <w:tcW w:type="dxa" w:w="2628"/>
             <w:vAlign w:val="center"/>
           </w:tcPr>
           <w:p>
@@ -13965,7 +14029,7 @@
       <w:tr>
         <w:tc>
           <w:tcPr>
-            <w:tcW w:type="dxa" w:w="2160"/>
+            <w:tcW w:type="dxa" w:w="2628"/>
           </w:tcPr>
           <w:p>
             <w:r>
@@ -13979,7 +14043,7 @@
         </w:tc>
         <w:tc>
           <w:tcPr>
-            <w:tcW w:type="dxa" w:w="2160"/>
+            <w:tcW w:type="dxa" w:w="2628"/>
           </w:tcPr>
           <w:p>
             <w:r>
@@ -13993,7 +14057,7 @@
         </w:tc>
         <w:tc>
           <w:tcPr>
-            <w:tcW w:type="dxa" w:w="2160"/>
+            <w:tcW w:type="dxa" w:w="2628"/>
           </w:tcPr>
           <w:p>
             <w:r>
@@ -14007,7 +14071,7 @@
         </w:tc>
         <w:tc>
           <w:tcPr>
-            <w:tcW w:type="dxa" w:w="2160"/>
+            <w:tcW w:type="dxa" w:w="2628"/>
           </w:tcPr>
           <w:p>
             <w:r>
@@ -14023,7 +14087,7 @@
       <w:tr>
         <w:tc>
           <w:tcPr>
-            <w:tcW w:type="dxa" w:w="2160"/>
+            <w:tcW w:type="dxa" w:w="2628"/>
           </w:tcPr>
           <w:p>
             <w:r>
@@ -14037,7 +14101,7 @@
         </w:tc>
         <w:tc>
           <w:tcPr>
-            <w:tcW w:type="dxa" w:w="2160"/>
+            <w:tcW w:type="dxa" w:w="2628"/>
           </w:tcPr>
           <w:p>
             <w:r>
@@ -14051,7 +14115,7 @@
         </w:tc>
         <w:tc>
           <w:tcPr>
-            <w:tcW w:type="dxa" w:w="2160"/>
+            <w:tcW w:type="dxa" w:w="2628"/>
           </w:tcPr>
           <w:p>
             <w:r>
@@ -14065,7 +14129,7 @@
         </w:tc>
         <w:tc>
           <w:tcPr>
-            <w:tcW w:type="dxa" w:w="2160"/>
+            <w:tcW w:type="dxa" w:w="2628"/>
           </w:tcPr>
           <w:p>
             <w:r>
@@ -14099,7 +14163,7 @@
       <w:tr>
         <w:tc>
           <w:tcPr>
-            <w:tcW w:type="dxa" w:w="2160"/>
+            <w:tcW w:type="dxa" w:w="2628"/>
           </w:tcPr>
           <w:p>
             <w:r>
@@ -14113,7 +14177,7 @@
         </w:tc>
         <w:tc>
           <w:tcPr>
-            <w:tcW w:type="dxa" w:w="2160"/>
+            <w:tcW w:type="dxa" w:w="2628"/>
           </w:tcPr>
           <w:p>
             <w:r>
@@ -14127,7 +14191,7 @@
         </w:tc>
         <w:tc>
           <w:tcPr>
-            <w:tcW w:type="dxa" w:w="2160"/>
+            <w:tcW w:type="dxa" w:w="2628"/>
           </w:tcPr>
           <w:p>
             <w:r>
@@ -14141,7 +14205,7 @@
         </w:tc>
         <w:tc>
           <w:tcPr>
-            <w:tcW w:type="dxa" w:w="2160"/>
+            <w:tcW w:type="dxa" w:w="2628"/>
           </w:tcPr>
           <w:p>
             <w:r>
@@ -14175,7 +14239,7 @@
       <w:tr>
         <w:tc>
           <w:tcPr>
-            <w:tcW w:type="dxa" w:w="2160"/>
+            <w:tcW w:type="dxa" w:w="2628"/>
           </w:tcPr>
           <w:p>
             <w:r>
@@ -14189,7 +14253,7 @@
         </w:tc>
         <w:tc>
           <w:tcPr>
-            <w:tcW w:type="dxa" w:w="2160"/>
+            <w:tcW w:type="dxa" w:w="2628"/>
           </w:tcPr>
           <w:p>
             <w:r>
@@ -14203,7 +14267,7 @@
         </w:tc>
         <w:tc>
           <w:tcPr>
-            <w:tcW w:type="dxa" w:w="2160"/>
+            <w:tcW w:type="dxa" w:w="2628"/>
           </w:tcPr>
           <w:p>
             <w:r>
@@ -14217,7 +14281,7 @@
         </w:tc>
         <w:tc>
           <w:tcPr>
-            <w:tcW w:type="dxa" w:w="2160"/>
+            <w:tcW w:type="dxa" w:w="2628"/>
           </w:tcPr>
           <w:p>
             <w:r>
@@ -14235,7 +14299,7 @@
       <w:tr>
         <w:tc>
           <w:tcPr>
-            <w:tcW w:type="dxa" w:w="2160"/>
+            <w:tcW w:type="dxa" w:w="2628"/>
           </w:tcPr>
           <w:p>
             <w:r>
@@ -14249,7 +14313,7 @@
         </w:tc>
         <w:tc>
           <w:tcPr>
-            <w:tcW w:type="dxa" w:w="2160"/>
+            <w:tcW w:type="dxa" w:w="2628"/>
           </w:tcPr>
           <w:p>
             <w:r>
@@ -14263,7 +14327,7 @@
         </w:tc>
         <w:tc>
           <w:tcPr>
-            <w:tcW w:type="dxa" w:w="2160"/>
+            <w:tcW w:type="dxa" w:w="2628"/>
           </w:tcPr>
           <w:p>
             <w:r>
@@ -14277,7 +14341,7 @@
         </w:tc>
         <w:tc>
           <w:tcPr>
-            <w:tcW w:type="dxa" w:w="2160"/>
+            <w:tcW w:type="dxa" w:w="2628"/>
           </w:tcPr>
           <w:p>
             <w:r>
@@ -14302,7 +14366,7 @@
       <w:tr>
         <w:tc>
           <w:tcPr>
-            <w:tcW w:type="dxa" w:w="2160"/>
+            <w:tcW w:type="dxa" w:w="2628"/>
           </w:tcPr>
           <w:p>
             <w:r>
@@ -14316,7 +14380,7 @@
         </w:tc>
         <w:tc>
           <w:tcPr>
-            <w:tcW w:type="dxa" w:w="2160"/>
+            <w:tcW w:type="dxa" w:w="2628"/>
           </w:tcPr>
           <w:p>
             <w:r>
@@ -14330,7 +14394,7 @@
         </w:tc>
         <w:tc>
           <w:tcPr>
-            <w:tcW w:type="dxa" w:w="2160"/>
+            <w:tcW w:type="dxa" w:w="2628"/>
           </w:tcPr>
           <w:p>
             <w:r>
@@ -14344,7 +14408,7 @@
         </w:tc>
         <w:tc>
           <w:tcPr>
-            <w:tcW w:type="dxa" w:w="2160"/>
+            <w:tcW w:type="dxa" w:w="2628"/>
           </w:tcPr>
           <w:p>
             <w:r>
@@ -14362,7 +14426,7 @@
       <w:tr>
         <w:tc>
           <w:tcPr>
-            <w:tcW w:type="dxa" w:w="2160"/>
+            <w:tcW w:type="dxa" w:w="2628"/>
           </w:tcPr>
           <w:p>
             <w:r>
@@ -14376,7 +14440,7 @@
         </w:tc>
         <w:tc>
           <w:tcPr>
-            <w:tcW w:type="dxa" w:w="2160"/>
+            <w:tcW w:type="dxa" w:w="2628"/>
           </w:tcPr>
           <w:p>
             <w:r>
@@ -14390,7 +14454,7 @@
         </w:tc>
         <w:tc>
           <w:tcPr>
-            <w:tcW w:type="dxa" w:w="2160"/>
+            <w:tcW w:type="dxa" w:w="2628"/>
           </w:tcPr>
           <w:p>
             <w:r>
@@ -14404,7 +14468,7 @@
         </w:tc>
         <w:tc>
           <w:tcPr>
-            <w:tcW w:type="dxa" w:w="2160"/>
+            <w:tcW w:type="dxa" w:w="2628"/>
           </w:tcPr>
           <w:p>
             <w:r>
@@ -14422,7 +14486,7 @@
       <w:tr>
         <w:tc>
           <w:tcPr>
-            <w:tcW w:type="dxa" w:w="2160"/>
+            <w:tcW w:type="dxa" w:w="2628"/>
           </w:tcPr>
           <w:p>
             <w:r>
@@ -14436,7 +14500,7 @@
         </w:tc>
         <w:tc>
           <w:tcPr>
-            <w:tcW w:type="dxa" w:w="2160"/>
+            <w:tcW w:type="dxa" w:w="2628"/>
           </w:tcPr>
           <w:p>
             <w:r>
@@ -14450,7 +14514,7 @@
         </w:tc>
         <w:tc>
           <w:tcPr>
-            <w:tcW w:type="dxa" w:w="2160"/>
+            <w:tcW w:type="dxa" w:w="2628"/>
           </w:tcPr>
           <w:p>
             <w:r>
@@ -14464,7 +14528,7 @@
         </w:tc>
         <w:tc>
           <w:tcPr>
-            <w:tcW w:type="dxa" w:w="2160"/>
+            <w:tcW w:type="dxa" w:w="2628"/>
           </w:tcPr>
           <w:p>
             <w:r>
@@ -14482,7 +14546,7 @@
       <w:tr>
         <w:tc>
           <w:tcPr>
-            <w:tcW w:type="dxa" w:w="2160"/>
+            <w:tcW w:type="dxa" w:w="2628"/>
           </w:tcPr>
           <w:p>
             <w:r>
@@ -14496,7 +14560,7 @@
         </w:tc>
         <w:tc>
           <w:tcPr>
-            <w:tcW w:type="dxa" w:w="2160"/>
+            <w:tcW w:type="dxa" w:w="2628"/>
           </w:tcPr>
           <w:p>
             <w:r>
@@ -14510,7 +14574,7 @@
         </w:tc>
         <w:tc>
           <w:tcPr>
-            <w:tcW w:type="dxa" w:w="2160"/>
+            <w:tcW w:type="dxa" w:w="2628"/>
           </w:tcPr>
           <w:p>
             <w:r>
@@ -14524,7 +14588,7 @@
         </w:tc>
         <w:tc>
           <w:tcPr>
-            <w:tcW w:type="dxa" w:w="2160"/>
+            <w:tcW w:type="dxa" w:w="2628"/>
           </w:tcPr>
           <w:p>
             <w:r>
@@ -14542,7 +14606,7 @@
       <w:tr>
         <w:tc>
           <w:tcPr>
-            <w:tcW w:type="dxa" w:w="2160"/>
+            <w:tcW w:type="dxa" w:w="2628"/>
           </w:tcPr>
           <w:p>
             <w:r>
@@ -14556,7 +14620,7 @@
         </w:tc>
         <w:tc>
           <w:tcPr>
-            <w:tcW w:type="dxa" w:w="2160"/>
+            <w:tcW w:type="dxa" w:w="2628"/>
           </w:tcPr>
           <w:p>
             <w:r>
@@ -14570,7 +14634,7 @@
         </w:tc>
         <w:tc>
           <w:tcPr>
-            <w:tcW w:type="dxa" w:w="2160"/>
+            <w:tcW w:type="dxa" w:w="2628"/>
           </w:tcPr>
           <w:p>
             <w:r>
@@ -14584,7 +14648,7 @@
         </w:tc>
         <w:tc>
           <w:tcPr>
-            <w:tcW w:type="dxa" w:w="2160"/>
+            <w:tcW w:type="dxa" w:w="2628"/>
           </w:tcPr>
           <w:p>
             <w:r>
@@ -14634,7 +14698,7 @@
       <w:tr>
         <w:tc>
           <w:tcPr>
-            <w:tcW w:type="dxa" w:w="2160"/>
+            <w:tcW w:type="dxa" w:w="2628"/>
           </w:tcPr>
           <w:p>
             <w:r>
@@ -14648,7 +14712,7 @@
         </w:tc>
         <w:tc>
           <w:tcPr>
-            <w:tcW w:type="dxa" w:w="2160"/>
+            <w:tcW w:type="dxa" w:w="2628"/>
           </w:tcPr>
           <w:p>
             <w:r>
@@ -14662,7 +14726,7 @@
         </w:tc>
         <w:tc>
           <w:tcPr>
-            <w:tcW w:type="dxa" w:w="2160"/>
+            <w:tcW w:type="dxa" w:w="2628"/>
           </w:tcPr>
           <w:p>
             <w:r>
@@ -14676,7 +14740,7 @@
         </w:tc>
         <w:tc>
           <w:tcPr>
-            <w:tcW w:type="dxa" w:w="2160"/>
+            <w:tcW w:type="dxa" w:w="2628"/>
           </w:tcPr>
           <w:p>
             <w:r>
@@ -14694,7 +14758,7 @@
       <w:tr>
         <w:tc>
           <w:tcPr>
-            <w:tcW w:type="dxa" w:w="2160"/>
+            <w:tcW w:type="dxa" w:w="2628"/>
           </w:tcPr>
           <w:p>
             <w:r>
@@ -14708,7 +14772,7 @@
         </w:tc>
         <w:tc>
           <w:tcPr>
-            <w:tcW w:type="dxa" w:w="2160"/>
+            <w:tcW w:type="dxa" w:w="2628"/>
           </w:tcPr>
           <w:p>
             <w:r>
@@ -14722,7 +14786,7 @@
         </w:tc>
         <w:tc>
           <w:tcPr>
-            <w:tcW w:type="dxa" w:w="2160"/>
+            <w:tcW w:type="dxa" w:w="2628"/>
           </w:tcPr>
           <w:p>
             <w:r>
@@ -14736,7 +14800,7 @@
         </w:tc>
         <w:tc>
           <w:tcPr>
-            <w:tcW w:type="dxa" w:w="2160"/>
+            <w:tcW w:type="dxa" w:w="2628"/>
           </w:tcPr>
           <w:p>
             <w:r>
@@ -14761,7 +14825,7 @@
       <w:tr>
         <w:tc>
           <w:tcPr>
-            <w:tcW w:type="dxa" w:w="2160"/>
+            <w:tcW w:type="dxa" w:w="2628"/>
           </w:tcPr>
           <w:p>
             <w:r>
@@ -14775,7 +14839,7 @@
         </w:tc>
         <w:tc>
           <w:tcPr>
-            <w:tcW w:type="dxa" w:w="2160"/>
+            <w:tcW w:type="dxa" w:w="2628"/>
           </w:tcPr>
           <w:p>
             <w:r>
@@ -14789,7 +14853,7 @@
         </w:tc>
         <w:tc>
           <w:tcPr>
-            <w:tcW w:type="dxa" w:w="2160"/>
+            <w:tcW w:type="dxa" w:w="2628"/>
           </w:tcPr>
           <w:p>
             <w:r>
@@ -14803,7 +14867,7 @@
         </w:tc>
         <w:tc>
           <w:tcPr>
-            <w:tcW w:type="dxa" w:w="2160"/>
+            <w:tcW w:type="dxa" w:w="2628"/>
           </w:tcPr>
           <w:p>
             <w:r>
@@ -14828,7 +14892,7 @@
       <w:tr>
         <w:tc>
           <w:tcPr>
-            <w:tcW w:type="dxa" w:w="2160"/>
+            <w:tcW w:type="dxa" w:w="2628"/>
           </w:tcPr>
           <w:p>
             <w:r>
@@ -14842,7 +14906,7 @@
         </w:tc>
         <w:tc>
           <w:tcPr>
-            <w:tcW w:type="dxa" w:w="2160"/>
+            <w:tcW w:type="dxa" w:w="2628"/>
           </w:tcPr>
           <w:p>
             <w:r>
@@ -14856,7 +14920,7 @@
         </w:tc>
         <w:tc>
           <w:tcPr>
-            <w:tcW w:type="dxa" w:w="2160"/>
+            <w:tcW w:type="dxa" w:w="2628"/>
           </w:tcPr>
           <w:p>
             <w:r>
@@ -14870,7 +14934,7 @@
         </w:tc>
         <w:tc>
           <w:tcPr>
-            <w:tcW w:type="dxa" w:w="2160"/>
+            <w:tcW w:type="dxa" w:w="2628"/>
           </w:tcPr>
           <w:p>
             <w:r>
@@ -14886,7 +14950,7 @@
       <w:tr>
         <w:tc>
           <w:tcPr>
-            <w:tcW w:type="dxa" w:w="2160"/>
+            <w:tcW w:type="dxa" w:w="2628"/>
           </w:tcPr>
           <w:p>
             <w:r>
@@ -14900,7 +14964,7 @@
         </w:tc>
         <w:tc>
           <w:tcPr>
-            <w:tcW w:type="dxa" w:w="2160"/>
+            <w:tcW w:type="dxa" w:w="2628"/>
           </w:tcPr>
           <w:p>
             <w:r>
@@ -14914,7 +14978,7 @@
         </w:tc>
         <w:tc>
           <w:tcPr>
-            <w:tcW w:type="dxa" w:w="2160"/>
+            <w:tcW w:type="dxa" w:w="2628"/>
           </w:tcPr>
           <w:p>
             <w:r>
@@ -14928,7 +14992,7 @@
         </w:tc>
         <w:tc>
           <w:tcPr>
-            <w:tcW w:type="dxa" w:w="2160"/>
+            <w:tcW w:type="dxa" w:w="2628"/>
           </w:tcPr>
           <w:p>
             <w:r>
@@ -14989,13 +15053,13 @@
         <w:tblLook w:firstColumn="1" w:firstRow="1" w:lastColumn="0" w:lastRow="0" w:noHBand="0" w:noVBand="1" w:val="04A0"/>
       </w:tblPr>
       <w:tblGrid>
-        <w:gridCol w:w="4320"/>
-        <w:gridCol w:w="4320"/>
+        <w:gridCol w:w="5256"/>
+        <w:gridCol w:w="5256"/>
       </w:tblGrid>
       <w:tr>
         <w:tc>
           <w:tcPr>
-            <w:tcW w:type="dxa" w:w="4320"/>
+            <w:tcW w:type="dxa" w:w="5256"/>
             <w:vAlign w:val="center"/>
           </w:tcPr>
           <w:p>
@@ -15010,7 +15074,7 @@
         </w:tc>
         <w:tc>
           <w:tcPr>
-            <w:tcW w:type="dxa" w:w="4320"/>
+            <w:tcW w:type="dxa" w:w="5256"/>
             <w:vAlign w:val="center"/>
           </w:tcPr>
           <w:p>
@@ -15027,7 +15091,7 @@
       <w:tr>
         <w:tc>
           <w:tcPr>
-            <w:tcW w:type="dxa" w:w="4320"/>
+            <w:tcW w:type="dxa" w:w="5256"/>
           </w:tcPr>
           <w:p>
             <w:r>
@@ -15041,7 +15105,7 @@
         </w:tc>
         <w:tc>
           <w:tcPr>
-            <w:tcW w:type="dxa" w:w="4320"/>
+            <w:tcW w:type="dxa" w:w="5256"/>
           </w:tcPr>
           <w:p>
             <w:r>
@@ -15058,7 +15122,7 @@
       <w:tr>
         <w:tc>
           <w:tcPr>
-            <w:tcW w:type="dxa" w:w="4320"/>
+            <w:tcW w:type="dxa" w:w="5256"/>
           </w:tcPr>
           <w:p>
             <w:r>
@@ -15072,7 +15136,7 @@
         </w:tc>
         <w:tc>
           <w:tcPr>
-            <w:tcW w:type="dxa" w:w="4320"/>
+            <w:tcW w:type="dxa" w:w="5256"/>
           </w:tcPr>
           <w:p>
             <w:r>
@@ -15089,7 +15153,7 @@
       <w:tr>
         <w:tc>
           <w:tcPr>
-            <w:tcW w:type="dxa" w:w="4320"/>
+            <w:tcW w:type="dxa" w:w="5256"/>
           </w:tcPr>
           <w:p>
             <w:r>
@@ -15103,7 +15167,7 @@
         </w:tc>
         <w:tc>
           <w:tcPr>
-            <w:tcW w:type="dxa" w:w="4320"/>
+            <w:tcW w:type="dxa" w:w="5256"/>
           </w:tcPr>
           <w:p>
             <w:r>
@@ -15120,7 +15184,7 @@
       <w:tr>
         <w:tc>
           <w:tcPr>
-            <w:tcW w:type="dxa" w:w="4320"/>
+            <w:tcW w:type="dxa" w:w="5256"/>
           </w:tcPr>
           <w:p>
             <w:r>
@@ -15134,7 +15198,7 @@
         </w:tc>
         <w:tc>
           <w:tcPr>
-            <w:tcW w:type="dxa" w:w="4320"/>
+            <w:tcW w:type="dxa" w:w="5256"/>
           </w:tcPr>
           <w:p>
             <w:r>
@@ -15151,7 +15215,7 @@
       <w:tr>
         <w:tc>
           <w:tcPr>
-            <w:tcW w:type="dxa" w:w="4320"/>
+            <w:tcW w:type="dxa" w:w="5256"/>
           </w:tcPr>
           <w:p>
             <w:r>
@@ -15165,7 +15229,7 @@
         </w:tc>
         <w:tc>
           <w:tcPr>
-            <w:tcW w:type="dxa" w:w="4320"/>
+            <w:tcW w:type="dxa" w:w="5256"/>
           </w:tcPr>
           <w:p>
             <w:r>
@@ -15184,7 +15248,7 @@
     <w:p/>
     <w:sectPr>
       <w:pgSz w:w="12240" w:h="15840"/>
-      <w:pgMar w:top="1440" w:right="1800" w:bottom="1440" w:left="1800" w:header="720" w:footer="720" w:gutter="0"/>
+      <w:pgMar w:top="1008" w:right="864" w:bottom="1008" w:left="864" w:header="720" w:footer="720" w:gutter="0"/>
       <w:cols w:space="720"/>
       <w:docGrid w:linePitch="360"/>
     </w:sectPr>

</xml_diff>